<commit_message>
Replace unclear unit-paper figures with HD redraws from original crops.
Embed U1/U2 printable Word/PDF with the new illustrations and add Records PDF download links.

Co-authored-by: Cursor <cursoragent@cursor.com>
</commit_message>
<xml_diff>
--- a/exams/U1_Unit1_Practice.docx
+++ b/exams/U1_Unit1_Practice.docx
@@ -4,7 +4,7 @@
   <w:body>
     <w:p>
       <w:pPr>
-        <w:spacing w:after="160" w:before="0" w:line="240" w:lineRule="auto"/>
+        <w:spacing w:before="0" w:after="80" w:line="240" w:lineRule="auto"/>
         <w:jc w:val="center"/>
       </w:pPr>
       <w:r>
@@ -18,7 +18,21 @@
     </w:p>
     <w:p>
       <w:pPr>
-        <w:spacing w:after="200" w:before="0" w:line="240" w:lineRule="auto"/>
+        <w:spacing w:before="0" w:after="120" w:line="240" w:lineRule="auto"/>
+        <w:jc w:val="center"/>
+      </w:pPr>
+      <w:r>
+        <w:rPr>
+          <w:rFonts w:ascii="宋体" w:hAnsi="宋体" w:eastAsia="宋体"/>
+          <w:b w:val="0"/>
+          <w:sz w:val="18"/>
+        </w:rPr>
+        <w:t>（图题已按原卷重绘高清版）</w:t>
+      </w:r>
+    </w:p>
+    <w:p>
+      <w:pPr>
+        <w:spacing w:before="0" w:after="160" w:line="240" w:lineRule="auto"/>
         <w:jc w:val="center"/>
       </w:pPr>
       <w:r>
@@ -32,7 +46,7 @@
     </w:p>
     <w:p>
       <w:pPr>
-        <w:spacing w:after="160" w:before="0" w:line="240" w:lineRule="auto"/>
+        <w:spacing w:before="0" w:after="160" w:line="240" w:lineRule="auto"/>
         <w:jc w:val="center"/>
       </w:pPr>
       <w:r>
@@ -46,7 +60,7 @@
     </w:p>
     <w:p>
       <w:pPr>
-        <w:spacing w:after="120" w:before="200" w:line="240" w:lineRule="auto"/>
+        <w:spacing w:before="200" w:after="120" w:line="240" w:lineRule="auto"/>
       </w:pPr>
       <w:r>
         <w:rPr>
@@ -59,7 +73,7 @@
     </w:p>
     <w:p>
       <w:pPr>
-        <w:spacing w:after="40" w:before="0" w:line="240" w:lineRule="auto"/>
+        <w:spacing w:before="0" w:after="40" w:line="240" w:lineRule="auto"/>
       </w:pPr>
       <w:r>
         <w:rPr>
@@ -70,35 +84,160 @@
         <w:t>1.</w:t>
       </w:r>
     </w:p>
+    <w:tbl>
+      <w:tblPr>
+        <w:tblW w:type="auto" w:w="0"/>
+        <w:tblLayout w:type="autofit"/>
+        <w:tblLook w:firstColumn="1" w:firstRow="1" w:lastColumn="0" w:lastRow="0" w:noHBand="0" w:noVBand="1" w:val="04A0"/>
+      </w:tblPr>
+      <w:tblGrid>
+        <w:gridCol w:w="5100"/>
+        <w:gridCol w:w="5100"/>
+      </w:tblGrid>
+      <w:tr>
+        <w:tc>
+          <w:tcPr>
+            <w:tcW w:type="dxa" w:w="5100"/>
+          </w:tcPr>
+          <w:p>
+            <w:pPr>
+              <w:jc w:val="center"/>
+            </w:pPr>
+            <w:r>
+              <w:drawing>
+                <wp:inline xmlns:a="http://schemas.openxmlformats.org/drawingml/2006/main" xmlns:pic="http://schemas.openxmlformats.org/drawingml/2006/picture">
+                  <wp:extent cx="1080000" cy="1080000"/>
+                  <wp:docPr id="1" name="Picture 1"/>
+                  <wp:cNvGraphicFramePr>
+                    <a:graphicFrameLocks noChangeAspect="1"/>
+                  </wp:cNvGraphicFramePr>
+                  <a:graphic>
+                    <a:graphicData uri="http://schemas.openxmlformats.org/drawingml/2006/picture">
+                      <pic:pic>
+                        <pic:nvPicPr>
+                          <pic:cNvPr id="0" name="u1_L1_1A.jpg"/>
+                          <pic:cNvPicPr/>
+                        </pic:nvPicPr>
+                        <pic:blipFill>
+                          <a:blip r:embed="rId9"/>
+                          <a:stretch>
+                            <a:fillRect/>
+                          </a:stretch>
+                        </pic:blipFill>
+                        <pic:spPr>
+                          <a:xfrm>
+                            <a:off x="0" y="0"/>
+                            <a:ext cx="1080000" cy="1080000"/>
+                          </a:xfrm>
+                          <a:prstGeom prst="rect"/>
+                        </pic:spPr>
+                      </pic:pic>
+                    </a:graphicData>
+                  </a:graphic>
+                </wp:inline>
+              </w:drawing>
+            </w:r>
+          </w:p>
+        </w:tc>
+        <w:tc>
+          <w:tcPr>
+            <w:tcW w:type="dxa" w:w="5100"/>
+          </w:tcPr>
+          <w:p>
+            <w:pPr>
+              <w:jc w:val="center"/>
+            </w:pPr>
+            <w:r>
+              <w:drawing>
+                <wp:inline xmlns:a="http://schemas.openxmlformats.org/drawingml/2006/main" xmlns:pic="http://schemas.openxmlformats.org/drawingml/2006/picture">
+                  <wp:extent cx="1080000" cy="1080000"/>
+                  <wp:docPr id="2" name="Picture 2"/>
+                  <wp:cNvGraphicFramePr>
+                    <a:graphicFrameLocks noChangeAspect="1"/>
+                  </wp:cNvGraphicFramePr>
+                  <a:graphic>
+                    <a:graphicData uri="http://schemas.openxmlformats.org/drawingml/2006/picture">
+                      <pic:pic>
+                        <pic:nvPicPr>
+                          <pic:cNvPr id="0" name="u1_L1_1B.jpg"/>
+                          <pic:cNvPicPr/>
+                        </pic:nvPicPr>
+                        <pic:blipFill>
+                          <a:blip r:embed="rId10"/>
+                          <a:stretch>
+                            <a:fillRect/>
+                          </a:stretch>
+                        </pic:blipFill>
+                        <pic:spPr>
+                          <a:xfrm>
+                            <a:off x="0" y="0"/>
+                            <a:ext cx="1080000" cy="1080000"/>
+                          </a:xfrm>
+                          <a:prstGeom prst="rect"/>
+                        </pic:spPr>
+                      </pic:pic>
+                    </a:graphicData>
+                  </a:graphic>
+                </wp:inline>
+              </w:drawing>
+            </w:r>
+          </w:p>
+        </w:tc>
+      </w:tr>
+      <w:tr>
+        <w:tc>
+          <w:tcPr>
+            <w:tcW w:type="dxa" w:w="5100"/>
+          </w:tcPr>
+          <w:p>
+            <w:pPr>
+              <w:jc w:val="center"/>
+            </w:pPr>
+            <w:r>
+              <w:rPr>
+                <w:rFonts w:ascii="宋体" w:hAnsi="宋体" w:eastAsia="宋体"/>
+                <w:b/>
+                <w:sz w:val="20"/>
+              </w:rPr>
+              <w:t>□ A</w:t>
+            </w:r>
+          </w:p>
+        </w:tc>
+        <w:tc>
+          <w:tcPr>
+            <w:tcW w:type="dxa" w:w="5100"/>
+          </w:tcPr>
+          <w:p>
+            <w:pPr>
+              <w:jc w:val="center"/>
+            </w:pPr>
+            <w:r>
+              <w:rPr>
+                <w:rFonts w:ascii="宋体" w:hAnsi="宋体" w:eastAsia="宋体"/>
+                <w:b/>
+                <w:sz w:val="20"/>
+              </w:rPr>
+              <w:t>□ B</w:t>
+            </w:r>
+          </w:p>
+        </w:tc>
+      </w:tr>
+    </w:tbl>
     <w:p>
       <w:pPr>
-        <w:spacing w:after="20" w:before="0" w:line="240" w:lineRule="auto"/>
+        <w:spacing w:before="0" w:after="80" w:line="240" w:lineRule="auto"/>
       </w:pPr>
       <w:r>
         <w:rPr>
           <w:rFonts w:ascii="宋体" w:hAnsi="宋体" w:eastAsia="宋体"/>
           <w:b w:val="0"/>
-          <w:sz w:val="20"/>
+          <w:sz w:val="12"/>
         </w:rPr>
-        <w:t xml:space="preserve">   □ A. 【图】高兴的男孩拿着纸（试卷/Aa）</w:t>
       </w:r>
     </w:p>
     <w:p>
       <w:pPr>
-        <w:spacing w:after="120" w:before="0" w:line="240" w:lineRule="auto"/>
-      </w:pPr>
-      <w:r>
-        <w:rPr>
-          <w:rFonts w:ascii="宋体" w:hAnsi="宋体" w:eastAsia="宋体"/>
-          <w:b w:val="0"/>
-          <w:sz w:val="20"/>
-        </w:rPr>
-        <w:t xml:space="preserve">   □ B. 【图】男孩在哭</w:t>
-      </w:r>
-    </w:p>
-    <w:p>
-      <w:pPr>
-        <w:spacing w:after="40" w:before="0" w:line="240" w:lineRule="auto"/>
+        <w:spacing w:before="0" w:after="40" w:line="240" w:lineRule="auto"/>
       </w:pPr>
       <w:r>
         <w:rPr>
@@ -109,35 +248,160 @@
         <w:t>2.</w:t>
       </w:r>
     </w:p>
+    <w:tbl>
+      <w:tblPr>
+        <w:tblW w:type="auto" w:w="0"/>
+        <w:tblLayout w:type="autofit"/>
+        <w:tblLook w:firstColumn="1" w:firstRow="1" w:lastColumn="0" w:lastRow="0" w:noHBand="0" w:noVBand="1" w:val="04A0"/>
+      </w:tblPr>
+      <w:tblGrid>
+        <w:gridCol w:w="5100"/>
+        <w:gridCol w:w="5100"/>
+      </w:tblGrid>
+      <w:tr>
+        <w:tc>
+          <w:tcPr>
+            <w:tcW w:type="dxa" w:w="5100"/>
+          </w:tcPr>
+          <w:p>
+            <w:pPr>
+              <w:jc w:val="center"/>
+            </w:pPr>
+            <w:r>
+              <w:drawing>
+                <wp:inline xmlns:a="http://schemas.openxmlformats.org/drawingml/2006/main" xmlns:pic="http://schemas.openxmlformats.org/drawingml/2006/picture">
+                  <wp:extent cx="1080000" cy="1080000"/>
+                  <wp:docPr id="3" name="Picture 3"/>
+                  <wp:cNvGraphicFramePr>
+                    <a:graphicFrameLocks noChangeAspect="1"/>
+                  </wp:cNvGraphicFramePr>
+                  <a:graphic>
+                    <a:graphicData uri="http://schemas.openxmlformats.org/drawingml/2006/picture">
+                      <pic:pic>
+                        <pic:nvPicPr>
+                          <pic:cNvPr id="0" name="u1_L1_2A.jpg"/>
+                          <pic:cNvPicPr/>
+                        </pic:nvPicPr>
+                        <pic:blipFill>
+                          <a:blip r:embed="rId11"/>
+                          <a:stretch>
+                            <a:fillRect/>
+                          </a:stretch>
+                        </pic:blipFill>
+                        <pic:spPr>
+                          <a:xfrm>
+                            <a:off x="0" y="0"/>
+                            <a:ext cx="1080000" cy="1080000"/>
+                          </a:xfrm>
+                          <a:prstGeom prst="rect"/>
+                        </pic:spPr>
+                      </pic:pic>
+                    </a:graphicData>
+                  </a:graphic>
+                </wp:inline>
+              </w:drawing>
+            </w:r>
+          </w:p>
+        </w:tc>
+        <w:tc>
+          <w:tcPr>
+            <w:tcW w:type="dxa" w:w="5100"/>
+          </w:tcPr>
+          <w:p>
+            <w:pPr>
+              <w:jc w:val="center"/>
+            </w:pPr>
+            <w:r>
+              <w:drawing>
+                <wp:inline xmlns:a="http://schemas.openxmlformats.org/drawingml/2006/main" xmlns:pic="http://schemas.openxmlformats.org/drawingml/2006/picture">
+                  <wp:extent cx="1080000" cy="1080000"/>
+                  <wp:docPr id="4" name="Picture 4"/>
+                  <wp:cNvGraphicFramePr>
+                    <a:graphicFrameLocks noChangeAspect="1"/>
+                  </wp:cNvGraphicFramePr>
+                  <a:graphic>
+                    <a:graphicData uri="http://schemas.openxmlformats.org/drawingml/2006/picture">
+                      <pic:pic>
+                        <pic:nvPicPr>
+                          <pic:cNvPr id="0" name="u1_L1_2B.jpg"/>
+                          <pic:cNvPicPr/>
+                        </pic:nvPicPr>
+                        <pic:blipFill>
+                          <a:blip r:embed="rId12"/>
+                          <a:stretch>
+                            <a:fillRect/>
+                          </a:stretch>
+                        </pic:blipFill>
+                        <pic:spPr>
+                          <a:xfrm>
+                            <a:off x="0" y="0"/>
+                            <a:ext cx="1080000" cy="1080000"/>
+                          </a:xfrm>
+                          <a:prstGeom prst="rect"/>
+                        </pic:spPr>
+                      </pic:pic>
+                    </a:graphicData>
+                  </a:graphic>
+                </wp:inline>
+              </w:drawing>
+            </w:r>
+          </w:p>
+        </w:tc>
+      </w:tr>
+      <w:tr>
+        <w:tc>
+          <w:tcPr>
+            <w:tcW w:type="dxa" w:w="5100"/>
+          </w:tcPr>
+          <w:p>
+            <w:pPr>
+              <w:jc w:val="center"/>
+            </w:pPr>
+            <w:r>
+              <w:rPr>
+                <w:rFonts w:ascii="宋体" w:hAnsi="宋体" w:eastAsia="宋体"/>
+                <w:b/>
+                <w:sz w:val="20"/>
+              </w:rPr>
+              <w:t>□ A</w:t>
+            </w:r>
+          </w:p>
+        </w:tc>
+        <w:tc>
+          <w:tcPr>
+            <w:tcW w:type="dxa" w:w="5100"/>
+          </w:tcPr>
+          <w:p>
+            <w:pPr>
+              <w:jc w:val="center"/>
+            </w:pPr>
+            <w:r>
+              <w:rPr>
+                <w:rFonts w:ascii="宋体" w:hAnsi="宋体" w:eastAsia="宋体"/>
+                <w:b/>
+                <w:sz w:val="20"/>
+              </w:rPr>
+              <w:t>□ B</w:t>
+            </w:r>
+          </w:p>
+        </w:tc>
+      </w:tr>
+    </w:tbl>
     <w:p>
       <w:pPr>
-        <w:spacing w:after="20" w:before="0" w:line="240" w:lineRule="auto"/>
+        <w:spacing w:before="0" w:after="80" w:line="240" w:lineRule="auto"/>
       </w:pPr>
       <w:r>
         <w:rPr>
           <w:rFonts w:ascii="宋体" w:hAnsi="宋体" w:eastAsia="宋体"/>
           <w:b w:val="0"/>
-          <w:sz w:val="20"/>
+          <w:sz w:val="12"/>
         </w:rPr>
-        <w:t xml:space="preserve">   □ A. 【图】看起来生气的男孩</w:t>
       </w:r>
     </w:p>
     <w:p>
       <w:pPr>
-        <w:spacing w:after="120" w:before="0" w:line="240" w:lineRule="auto"/>
-      </w:pPr>
-      <w:r>
-        <w:rPr>
-          <w:rFonts w:ascii="宋体" w:hAnsi="宋体" w:eastAsia="宋体"/>
-          <w:b w:val="0"/>
-          <w:sz w:val="20"/>
-        </w:rPr>
-        <w:t xml:space="preserve">   □ B. 【图】高兴跳起的男孩</w:t>
-      </w:r>
-    </w:p>
-    <w:p>
-      <w:pPr>
-        <w:spacing w:after="40" w:before="0" w:line="240" w:lineRule="auto"/>
+        <w:spacing w:before="0" w:after="40" w:line="240" w:lineRule="auto"/>
       </w:pPr>
       <w:r>
         <w:rPr>
@@ -148,35 +412,160 @@
         <w:t>3.</w:t>
       </w:r>
     </w:p>
+    <w:tbl>
+      <w:tblPr>
+        <w:tblW w:type="auto" w:w="0"/>
+        <w:tblLayout w:type="autofit"/>
+        <w:tblLook w:firstColumn="1" w:firstRow="1" w:lastColumn="0" w:lastRow="0" w:noHBand="0" w:noVBand="1" w:val="04A0"/>
+      </w:tblPr>
+      <w:tblGrid>
+        <w:gridCol w:w="5100"/>
+        <w:gridCol w:w="5100"/>
+      </w:tblGrid>
+      <w:tr>
+        <w:tc>
+          <w:tcPr>
+            <w:tcW w:type="dxa" w:w="5100"/>
+          </w:tcPr>
+          <w:p>
+            <w:pPr>
+              <w:jc w:val="center"/>
+            </w:pPr>
+            <w:r>
+              <w:drawing>
+                <wp:inline xmlns:a="http://schemas.openxmlformats.org/drawingml/2006/main" xmlns:pic="http://schemas.openxmlformats.org/drawingml/2006/picture">
+                  <wp:extent cx="1080000" cy="1080000"/>
+                  <wp:docPr id="5" name="Picture 5"/>
+                  <wp:cNvGraphicFramePr>
+                    <a:graphicFrameLocks noChangeAspect="1"/>
+                  </wp:cNvGraphicFramePr>
+                  <a:graphic>
+                    <a:graphicData uri="http://schemas.openxmlformats.org/drawingml/2006/picture">
+                      <pic:pic>
+                        <pic:nvPicPr>
+                          <pic:cNvPr id="0" name="u1_L1_3A.jpg"/>
+                          <pic:cNvPicPr/>
+                        </pic:nvPicPr>
+                        <pic:blipFill>
+                          <a:blip r:embed="rId13"/>
+                          <a:stretch>
+                            <a:fillRect/>
+                          </a:stretch>
+                        </pic:blipFill>
+                        <pic:spPr>
+                          <a:xfrm>
+                            <a:off x="0" y="0"/>
+                            <a:ext cx="1080000" cy="1080000"/>
+                          </a:xfrm>
+                          <a:prstGeom prst="rect"/>
+                        </pic:spPr>
+                      </pic:pic>
+                    </a:graphicData>
+                  </a:graphic>
+                </wp:inline>
+              </w:drawing>
+            </w:r>
+          </w:p>
+        </w:tc>
+        <w:tc>
+          <w:tcPr>
+            <w:tcW w:type="dxa" w:w="5100"/>
+          </w:tcPr>
+          <w:p>
+            <w:pPr>
+              <w:jc w:val="center"/>
+            </w:pPr>
+            <w:r>
+              <w:drawing>
+                <wp:inline xmlns:a="http://schemas.openxmlformats.org/drawingml/2006/main" xmlns:pic="http://schemas.openxmlformats.org/drawingml/2006/picture">
+                  <wp:extent cx="1080000" cy="1080000"/>
+                  <wp:docPr id="6" name="Picture 6"/>
+                  <wp:cNvGraphicFramePr>
+                    <a:graphicFrameLocks noChangeAspect="1"/>
+                  </wp:cNvGraphicFramePr>
+                  <a:graphic>
+                    <a:graphicData uri="http://schemas.openxmlformats.org/drawingml/2006/picture">
+                      <pic:pic>
+                        <pic:nvPicPr>
+                          <pic:cNvPr id="0" name="u1_L1_3B.jpg"/>
+                          <pic:cNvPicPr/>
+                        </pic:nvPicPr>
+                        <pic:blipFill>
+                          <a:blip r:embed="rId14"/>
+                          <a:stretch>
+                            <a:fillRect/>
+                          </a:stretch>
+                        </pic:blipFill>
+                        <pic:spPr>
+                          <a:xfrm>
+                            <a:off x="0" y="0"/>
+                            <a:ext cx="1080000" cy="1080000"/>
+                          </a:xfrm>
+                          <a:prstGeom prst="rect"/>
+                        </pic:spPr>
+                      </pic:pic>
+                    </a:graphicData>
+                  </a:graphic>
+                </wp:inline>
+              </w:drawing>
+            </w:r>
+          </w:p>
+        </w:tc>
+      </w:tr>
+      <w:tr>
+        <w:tc>
+          <w:tcPr>
+            <w:tcW w:type="dxa" w:w="5100"/>
+          </w:tcPr>
+          <w:p>
+            <w:pPr>
+              <w:jc w:val="center"/>
+            </w:pPr>
+            <w:r>
+              <w:rPr>
+                <w:rFonts w:ascii="宋体" w:hAnsi="宋体" w:eastAsia="宋体"/>
+                <w:b/>
+                <w:sz w:val="20"/>
+              </w:rPr>
+              <w:t>□ A</w:t>
+            </w:r>
+          </w:p>
+        </w:tc>
+        <w:tc>
+          <w:tcPr>
+            <w:tcW w:type="dxa" w:w="5100"/>
+          </w:tcPr>
+          <w:p>
+            <w:pPr>
+              <w:jc w:val="center"/>
+            </w:pPr>
+            <w:r>
+              <w:rPr>
+                <w:rFonts w:ascii="宋体" w:hAnsi="宋体" w:eastAsia="宋体"/>
+                <w:b/>
+                <w:sz w:val="20"/>
+              </w:rPr>
+              <w:t>□ B</w:t>
+            </w:r>
+          </w:p>
+        </w:tc>
+      </w:tr>
+    </w:tbl>
     <w:p>
       <w:pPr>
-        <w:spacing w:after="20" w:before="0" w:line="240" w:lineRule="auto"/>
+        <w:spacing w:before="0" w:after="80" w:line="240" w:lineRule="auto"/>
       </w:pPr>
       <w:r>
         <w:rPr>
           <w:rFonts w:ascii="宋体" w:hAnsi="宋体" w:eastAsia="宋体"/>
           <w:b w:val="0"/>
-          <w:sz w:val="20"/>
+          <w:sz w:val="12"/>
         </w:rPr>
-        <w:t xml:space="preserve">   □ A. 【图】女孩在读书</w:t>
       </w:r>
     </w:p>
     <w:p>
       <w:pPr>
-        <w:spacing w:after="120" w:before="0" w:line="240" w:lineRule="auto"/>
-      </w:pPr>
-      <w:r>
-        <w:rPr>
-          <w:rFonts w:ascii="宋体" w:hAnsi="宋体" w:eastAsia="宋体"/>
-          <w:b w:val="0"/>
-          <w:sz w:val="20"/>
-        </w:rPr>
-        <w:t xml:space="preserve">   □ B. 【图】女孩难过/在哭</w:t>
-      </w:r>
-    </w:p>
-    <w:p>
-      <w:pPr>
-        <w:spacing w:after="40" w:before="0" w:line="240" w:lineRule="auto"/>
+        <w:spacing w:before="0" w:after="40" w:line="240" w:lineRule="auto"/>
       </w:pPr>
       <w:r>
         <w:rPr>
@@ -187,35 +576,160 @@
         <w:t>4.</w:t>
       </w:r>
     </w:p>
+    <w:tbl>
+      <w:tblPr>
+        <w:tblW w:type="auto" w:w="0"/>
+        <w:tblLayout w:type="autofit"/>
+        <w:tblLook w:firstColumn="1" w:firstRow="1" w:lastColumn="0" w:lastRow="0" w:noHBand="0" w:noVBand="1" w:val="04A0"/>
+      </w:tblPr>
+      <w:tblGrid>
+        <w:gridCol w:w="5100"/>
+        <w:gridCol w:w="5100"/>
+      </w:tblGrid>
+      <w:tr>
+        <w:tc>
+          <w:tcPr>
+            <w:tcW w:type="dxa" w:w="5100"/>
+          </w:tcPr>
+          <w:p>
+            <w:pPr>
+              <w:jc w:val="center"/>
+            </w:pPr>
+            <w:r>
+              <w:drawing>
+                <wp:inline xmlns:a="http://schemas.openxmlformats.org/drawingml/2006/main" xmlns:pic="http://schemas.openxmlformats.org/drawingml/2006/picture">
+                  <wp:extent cx="1080000" cy="1080000"/>
+                  <wp:docPr id="7" name="Picture 7"/>
+                  <wp:cNvGraphicFramePr>
+                    <a:graphicFrameLocks noChangeAspect="1"/>
+                  </wp:cNvGraphicFramePr>
+                  <a:graphic>
+                    <a:graphicData uri="http://schemas.openxmlformats.org/drawingml/2006/picture">
+                      <pic:pic>
+                        <pic:nvPicPr>
+                          <pic:cNvPr id="0" name="u1_L1_4A.jpg"/>
+                          <pic:cNvPicPr/>
+                        </pic:nvPicPr>
+                        <pic:blipFill>
+                          <a:blip r:embed="rId15"/>
+                          <a:stretch>
+                            <a:fillRect/>
+                          </a:stretch>
+                        </pic:blipFill>
+                        <pic:spPr>
+                          <a:xfrm>
+                            <a:off x="0" y="0"/>
+                            <a:ext cx="1080000" cy="1080000"/>
+                          </a:xfrm>
+                          <a:prstGeom prst="rect"/>
+                        </pic:spPr>
+                      </pic:pic>
+                    </a:graphicData>
+                  </a:graphic>
+                </wp:inline>
+              </w:drawing>
+            </w:r>
+          </w:p>
+        </w:tc>
+        <w:tc>
+          <w:tcPr>
+            <w:tcW w:type="dxa" w:w="5100"/>
+          </w:tcPr>
+          <w:p>
+            <w:pPr>
+              <w:jc w:val="center"/>
+            </w:pPr>
+            <w:r>
+              <w:drawing>
+                <wp:inline xmlns:a="http://schemas.openxmlformats.org/drawingml/2006/main" xmlns:pic="http://schemas.openxmlformats.org/drawingml/2006/picture">
+                  <wp:extent cx="1080000" cy="1080000"/>
+                  <wp:docPr id="8" name="Picture 8"/>
+                  <wp:cNvGraphicFramePr>
+                    <a:graphicFrameLocks noChangeAspect="1"/>
+                  </wp:cNvGraphicFramePr>
+                  <a:graphic>
+                    <a:graphicData uri="http://schemas.openxmlformats.org/drawingml/2006/picture">
+                      <pic:pic>
+                        <pic:nvPicPr>
+                          <pic:cNvPr id="0" name="u1_L1_4B.jpg"/>
+                          <pic:cNvPicPr/>
+                        </pic:nvPicPr>
+                        <pic:blipFill>
+                          <a:blip r:embed="rId16"/>
+                          <a:stretch>
+                            <a:fillRect/>
+                          </a:stretch>
+                        </pic:blipFill>
+                        <pic:spPr>
+                          <a:xfrm>
+                            <a:off x="0" y="0"/>
+                            <a:ext cx="1080000" cy="1080000"/>
+                          </a:xfrm>
+                          <a:prstGeom prst="rect"/>
+                        </pic:spPr>
+                      </pic:pic>
+                    </a:graphicData>
+                  </a:graphic>
+                </wp:inline>
+              </w:drawing>
+            </w:r>
+          </w:p>
+        </w:tc>
+      </w:tr>
+      <w:tr>
+        <w:tc>
+          <w:tcPr>
+            <w:tcW w:type="dxa" w:w="5100"/>
+          </w:tcPr>
+          <w:p>
+            <w:pPr>
+              <w:jc w:val="center"/>
+            </w:pPr>
+            <w:r>
+              <w:rPr>
+                <w:rFonts w:ascii="宋体" w:hAnsi="宋体" w:eastAsia="宋体"/>
+                <w:b/>
+                <w:sz w:val="20"/>
+              </w:rPr>
+              <w:t>□ A</w:t>
+            </w:r>
+          </w:p>
+        </w:tc>
+        <w:tc>
+          <w:tcPr>
+            <w:tcW w:type="dxa" w:w="5100"/>
+          </w:tcPr>
+          <w:p>
+            <w:pPr>
+              <w:jc w:val="center"/>
+            </w:pPr>
+            <w:r>
+              <w:rPr>
+                <w:rFonts w:ascii="宋体" w:hAnsi="宋体" w:eastAsia="宋体"/>
+                <w:b/>
+                <w:sz w:val="20"/>
+              </w:rPr>
+              <w:t>□ B</w:t>
+            </w:r>
+          </w:p>
+        </w:tc>
+      </w:tr>
+    </w:tbl>
     <w:p>
       <w:pPr>
-        <w:spacing w:after="20" w:before="0" w:line="240" w:lineRule="auto"/>
+        <w:spacing w:before="0" w:after="80" w:line="240" w:lineRule="auto"/>
       </w:pPr>
       <w:r>
         <w:rPr>
           <w:rFonts w:ascii="宋体" w:hAnsi="宋体" w:eastAsia="宋体"/>
           <w:b w:val="0"/>
-          <w:sz w:val="20"/>
+          <w:sz w:val="12"/>
         </w:rPr>
-        <w:t xml:space="preserve">   □ A. 【图】两个孩子在地板上一起玩</w:t>
       </w:r>
     </w:p>
     <w:p>
       <w:pPr>
-        <w:spacing w:after="120" w:before="0" w:line="240" w:lineRule="auto"/>
-      </w:pPr>
-      <w:r>
-        <w:rPr>
-          <w:rFonts w:ascii="宋体" w:hAnsi="宋体" w:eastAsia="宋体"/>
-          <w:b w:val="0"/>
-          <w:sz w:val="20"/>
-        </w:rPr>
-        <w:t xml:space="preserve">   □ B. 【图】一个女孩把东西递给另一个女孩</w:t>
-      </w:r>
-    </w:p>
-    <w:p>
-      <w:pPr>
-        <w:spacing w:after="40" w:before="0" w:line="240" w:lineRule="auto"/>
+        <w:spacing w:before="0" w:after="40" w:line="240" w:lineRule="auto"/>
       </w:pPr>
       <w:r>
         <w:rPr>
@@ -226,35 +740,160 @@
         <w:t>5.</w:t>
       </w:r>
     </w:p>
+    <w:tbl>
+      <w:tblPr>
+        <w:tblW w:type="auto" w:w="0"/>
+        <w:tblLayout w:type="autofit"/>
+        <w:tblLook w:firstColumn="1" w:firstRow="1" w:lastColumn="0" w:lastRow="0" w:noHBand="0" w:noVBand="1" w:val="04A0"/>
+      </w:tblPr>
+      <w:tblGrid>
+        <w:gridCol w:w="5100"/>
+        <w:gridCol w:w="5100"/>
+      </w:tblGrid>
+      <w:tr>
+        <w:tc>
+          <w:tcPr>
+            <w:tcW w:type="dxa" w:w="5100"/>
+          </w:tcPr>
+          <w:p>
+            <w:pPr>
+              <w:jc w:val="center"/>
+            </w:pPr>
+            <w:r>
+              <w:drawing>
+                <wp:inline xmlns:a="http://schemas.openxmlformats.org/drawingml/2006/main" xmlns:pic="http://schemas.openxmlformats.org/drawingml/2006/picture">
+                  <wp:extent cx="1080000" cy="1080000"/>
+                  <wp:docPr id="9" name="Picture 9"/>
+                  <wp:cNvGraphicFramePr>
+                    <a:graphicFrameLocks noChangeAspect="1"/>
+                  </wp:cNvGraphicFramePr>
+                  <a:graphic>
+                    <a:graphicData uri="http://schemas.openxmlformats.org/drawingml/2006/picture">
+                      <pic:pic>
+                        <pic:nvPicPr>
+                          <pic:cNvPr id="0" name="u1_L1_5A.jpg"/>
+                          <pic:cNvPicPr/>
+                        </pic:nvPicPr>
+                        <pic:blipFill>
+                          <a:blip r:embed="rId17"/>
+                          <a:stretch>
+                            <a:fillRect/>
+                          </a:stretch>
+                        </pic:blipFill>
+                        <pic:spPr>
+                          <a:xfrm>
+                            <a:off x="0" y="0"/>
+                            <a:ext cx="1080000" cy="1080000"/>
+                          </a:xfrm>
+                          <a:prstGeom prst="rect"/>
+                        </pic:spPr>
+                      </pic:pic>
+                    </a:graphicData>
+                  </a:graphic>
+                </wp:inline>
+              </w:drawing>
+            </w:r>
+          </w:p>
+        </w:tc>
+        <w:tc>
+          <w:tcPr>
+            <w:tcW w:type="dxa" w:w="5100"/>
+          </w:tcPr>
+          <w:p>
+            <w:pPr>
+              <w:jc w:val="center"/>
+            </w:pPr>
+            <w:r>
+              <w:drawing>
+                <wp:inline xmlns:a="http://schemas.openxmlformats.org/drawingml/2006/main" xmlns:pic="http://schemas.openxmlformats.org/drawingml/2006/picture">
+                  <wp:extent cx="1080000" cy="1080000"/>
+                  <wp:docPr id="10" name="Picture 10"/>
+                  <wp:cNvGraphicFramePr>
+                    <a:graphicFrameLocks noChangeAspect="1"/>
+                  </wp:cNvGraphicFramePr>
+                  <a:graphic>
+                    <a:graphicData uri="http://schemas.openxmlformats.org/drawingml/2006/picture">
+                      <pic:pic>
+                        <pic:nvPicPr>
+                          <pic:cNvPr id="0" name="u1_L1_5B.jpg"/>
+                          <pic:cNvPicPr/>
+                        </pic:nvPicPr>
+                        <pic:blipFill>
+                          <a:blip r:embed="rId18"/>
+                          <a:stretch>
+                            <a:fillRect/>
+                          </a:stretch>
+                        </pic:blipFill>
+                        <pic:spPr>
+                          <a:xfrm>
+                            <a:off x="0" y="0"/>
+                            <a:ext cx="1080000" cy="1080000"/>
+                          </a:xfrm>
+                          <a:prstGeom prst="rect"/>
+                        </pic:spPr>
+                      </pic:pic>
+                    </a:graphicData>
+                  </a:graphic>
+                </wp:inline>
+              </w:drawing>
+            </w:r>
+          </w:p>
+        </w:tc>
+      </w:tr>
+      <w:tr>
+        <w:tc>
+          <w:tcPr>
+            <w:tcW w:type="dxa" w:w="5100"/>
+          </w:tcPr>
+          <w:p>
+            <w:pPr>
+              <w:jc w:val="center"/>
+            </w:pPr>
+            <w:r>
+              <w:rPr>
+                <w:rFonts w:ascii="宋体" w:hAnsi="宋体" w:eastAsia="宋体"/>
+                <w:b/>
+                <w:sz w:val="20"/>
+              </w:rPr>
+              <w:t>□ A</w:t>
+            </w:r>
+          </w:p>
+        </w:tc>
+        <w:tc>
+          <w:tcPr>
+            <w:tcW w:type="dxa" w:w="5100"/>
+          </w:tcPr>
+          <w:p>
+            <w:pPr>
+              <w:jc w:val="center"/>
+            </w:pPr>
+            <w:r>
+              <w:rPr>
+                <w:rFonts w:ascii="宋体" w:hAnsi="宋体" w:eastAsia="宋体"/>
+                <w:b/>
+                <w:sz w:val="20"/>
+              </w:rPr>
+              <w:t>□ B</w:t>
+            </w:r>
+          </w:p>
+        </w:tc>
+      </w:tr>
+    </w:tbl>
     <w:p>
       <w:pPr>
-        <w:spacing w:after="20" w:before="0" w:line="240" w:lineRule="auto"/>
+        <w:spacing w:before="0" w:after="80" w:line="240" w:lineRule="auto"/>
       </w:pPr>
       <w:r>
         <w:rPr>
           <w:rFonts w:ascii="宋体" w:hAnsi="宋体" w:eastAsia="宋体"/>
           <w:b w:val="0"/>
-          <w:sz w:val="20"/>
+          <w:sz w:val="12"/>
         </w:rPr>
-        <w:t xml:space="preserve">   □ A. 【图】男孩用力往前跑</w:t>
       </w:r>
     </w:p>
     <w:p>
       <w:pPr>
-        <w:spacing w:after="120" w:before="0" w:line="240" w:lineRule="auto"/>
-      </w:pPr>
-      <w:r>
-        <w:rPr>
-          <w:rFonts w:ascii="宋体" w:hAnsi="宋体" w:eastAsia="宋体"/>
-          <w:b w:val="0"/>
-          <w:sz w:val="20"/>
-        </w:rPr>
-        <w:t xml:space="preserve">   □ B. 【图】男孩伤心/低着头走路</w:t>
-      </w:r>
-    </w:p>
-    <w:p>
-      <w:pPr>
-        <w:spacing w:after="40" w:before="0" w:line="240" w:lineRule="auto"/>
+        <w:spacing w:before="0" w:after="40" w:line="240" w:lineRule="auto"/>
       </w:pPr>
       <w:r>
         <w:rPr>
@@ -265,35 +904,160 @@
         <w:t>6.</w:t>
       </w:r>
     </w:p>
+    <w:tbl>
+      <w:tblPr>
+        <w:tblW w:type="auto" w:w="0"/>
+        <w:tblLayout w:type="autofit"/>
+        <w:tblLook w:firstColumn="1" w:firstRow="1" w:lastColumn="0" w:lastRow="0" w:noHBand="0" w:noVBand="1" w:val="04A0"/>
+      </w:tblPr>
+      <w:tblGrid>
+        <w:gridCol w:w="5100"/>
+        <w:gridCol w:w="5100"/>
+      </w:tblGrid>
+      <w:tr>
+        <w:tc>
+          <w:tcPr>
+            <w:tcW w:type="dxa" w:w="5100"/>
+          </w:tcPr>
+          <w:p>
+            <w:pPr>
+              <w:jc w:val="center"/>
+            </w:pPr>
+            <w:r>
+              <w:drawing>
+                <wp:inline xmlns:a="http://schemas.openxmlformats.org/drawingml/2006/main" xmlns:pic="http://schemas.openxmlformats.org/drawingml/2006/picture">
+                  <wp:extent cx="1080000" cy="1080000"/>
+                  <wp:docPr id="11" name="Picture 11"/>
+                  <wp:cNvGraphicFramePr>
+                    <a:graphicFrameLocks noChangeAspect="1"/>
+                  </wp:cNvGraphicFramePr>
+                  <a:graphic>
+                    <a:graphicData uri="http://schemas.openxmlformats.org/drawingml/2006/picture">
+                      <pic:pic>
+                        <pic:nvPicPr>
+                          <pic:cNvPr id="0" name="u1_L1_6A.jpg"/>
+                          <pic:cNvPicPr/>
+                        </pic:nvPicPr>
+                        <pic:blipFill>
+                          <a:blip r:embed="rId19"/>
+                          <a:stretch>
+                            <a:fillRect/>
+                          </a:stretch>
+                        </pic:blipFill>
+                        <pic:spPr>
+                          <a:xfrm>
+                            <a:off x="0" y="0"/>
+                            <a:ext cx="1080000" cy="1080000"/>
+                          </a:xfrm>
+                          <a:prstGeom prst="rect"/>
+                        </pic:spPr>
+                      </pic:pic>
+                    </a:graphicData>
+                  </a:graphic>
+                </wp:inline>
+              </w:drawing>
+            </w:r>
+          </w:p>
+        </w:tc>
+        <w:tc>
+          <w:tcPr>
+            <w:tcW w:type="dxa" w:w="5100"/>
+          </w:tcPr>
+          <w:p>
+            <w:pPr>
+              <w:jc w:val="center"/>
+            </w:pPr>
+            <w:r>
+              <w:drawing>
+                <wp:inline xmlns:a="http://schemas.openxmlformats.org/drawingml/2006/main" xmlns:pic="http://schemas.openxmlformats.org/drawingml/2006/picture">
+                  <wp:extent cx="1080000" cy="1080000"/>
+                  <wp:docPr id="12" name="Picture 12"/>
+                  <wp:cNvGraphicFramePr>
+                    <a:graphicFrameLocks noChangeAspect="1"/>
+                  </wp:cNvGraphicFramePr>
+                  <a:graphic>
+                    <a:graphicData uri="http://schemas.openxmlformats.org/drawingml/2006/picture">
+                      <pic:pic>
+                        <pic:nvPicPr>
+                          <pic:cNvPr id="0" name="u1_L1_6B.jpg"/>
+                          <pic:cNvPicPr/>
+                        </pic:nvPicPr>
+                        <pic:blipFill>
+                          <a:blip r:embed="rId20"/>
+                          <a:stretch>
+                            <a:fillRect/>
+                          </a:stretch>
+                        </pic:blipFill>
+                        <pic:spPr>
+                          <a:xfrm>
+                            <a:off x="0" y="0"/>
+                            <a:ext cx="1080000" cy="1080000"/>
+                          </a:xfrm>
+                          <a:prstGeom prst="rect"/>
+                        </pic:spPr>
+                      </pic:pic>
+                    </a:graphicData>
+                  </a:graphic>
+                </wp:inline>
+              </w:drawing>
+            </w:r>
+          </w:p>
+        </w:tc>
+      </w:tr>
+      <w:tr>
+        <w:tc>
+          <w:tcPr>
+            <w:tcW w:type="dxa" w:w="5100"/>
+          </w:tcPr>
+          <w:p>
+            <w:pPr>
+              <w:jc w:val="center"/>
+            </w:pPr>
+            <w:r>
+              <w:rPr>
+                <w:rFonts w:ascii="宋体" w:hAnsi="宋体" w:eastAsia="宋体"/>
+                <w:b/>
+                <w:sz w:val="20"/>
+              </w:rPr>
+              <w:t>□ A</w:t>
+            </w:r>
+          </w:p>
+        </w:tc>
+        <w:tc>
+          <w:tcPr>
+            <w:tcW w:type="dxa" w:w="5100"/>
+          </w:tcPr>
+          <w:p>
+            <w:pPr>
+              <w:jc w:val="center"/>
+            </w:pPr>
+            <w:r>
+              <w:rPr>
+                <w:rFonts w:ascii="宋体" w:hAnsi="宋体" w:eastAsia="宋体"/>
+                <w:b/>
+                <w:sz w:val="20"/>
+              </w:rPr>
+              <w:t>□ B</w:t>
+            </w:r>
+          </w:p>
+        </w:tc>
+      </w:tr>
+    </w:tbl>
     <w:p>
       <w:pPr>
-        <w:spacing w:after="20" w:before="0" w:line="240" w:lineRule="auto"/>
+        <w:spacing w:before="0" w:after="80" w:line="240" w:lineRule="auto"/>
       </w:pPr>
       <w:r>
         <w:rPr>
           <w:rFonts w:ascii="宋体" w:hAnsi="宋体" w:eastAsia="宋体"/>
           <w:b w:val="0"/>
-          <w:sz w:val="20"/>
+          <w:sz w:val="12"/>
         </w:rPr>
-        <w:t xml:space="preserve">   □ A. 【图】两个男孩在争吵/打架</w:t>
       </w:r>
     </w:p>
     <w:p>
       <w:pPr>
-        <w:spacing w:after="120" w:before="0" w:line="240" w:lineRule="auto"/>
-      </w:pPr>
-      <w:r>
-        <w:rPr>
-          <w:rFonts w:ascii="宋体" w:hAnsi="宋体" w:eastAsia="宋体"/>
-          <w:b w:val="0"/>
-          <w:sz w:val="20"/>
-        </w:rPr>
-        <w:t xml:space="preserve">   □ B. 【图】男孩安慰哭泣的女孩</w:t>
-      </w:r>
-    </w:p>
-    <w:p>
-      <w:pPr>
-        <w:spacing w:after="120" w:before="200" w:line="240" w:lineRule="auto"/>
+        <w:spacing w:before="200" w:after="120" w:line="240" w:lineRule="auto"/>
       </w:pPr>
       <w:r>
         <w:rPr>
@@ -304,61 +1068,273 @@
         <w:t>二、听对话，根据听到的顺序，用数字 1–4 给下列图片排序。</w:t>
       </w:r>
     </w:p>
+    <w:tbl>
+      <w:tblPr>
+        <w:tblW w:type="auto" w:w="0"/>
+        <w:tblLook w:firstColumn="1" w:firstRow="1" w:lastColumn="0" w:lastRow="0" w:noHBand="0" w:noVBand="1" w:val="04A0"/>
+      </w:tblPr>
+      <w:tblGrid>
+        <w:gridCol w:w="2550"/>
+        <w:gridCol w:w="2550"/>
+        <w:gridCol w:w="2550"/>
+        <w:gridCol w:w="2550"/>
+      </w:tblGrid>
+      <w:tr>
+        <w:tc>
+          <w:tcPr>
+            <w:tcW w:type="dxa" w:w="2550"/>
+          </w:tcPr>
+          <w:p>
+            <w:pPr>
+              <w:jc w:val="center"/>
+            </w:pPr>
+            <w:r>
+              <w:drawing>
+                <wp:inline xmlns:a="http://schemas.openxmlformats.org/drawingml/2006/main" xmlns:pic="http://schemas.openxmlformats.org/drawingml/2006/picture">
+                  <wp:extent cx="1007999" cy="1007999"/>
+                  <wp:docPr id="13" name="Picture 13"/>
+                  <wp:cNvGraphicFramePr>
+                    <a:graphicFrameLocks noChangeAspect="1"/>
+                  </wp:cNvGraphicFramePr>
+                  <a:graphic>
+                    <a:graphicData uri="http://schemas.openxmlformats.org/drawingml/2006/picture">
+                      <pic:pic>
+                        <pic:nvPicPr>
+                          <pic:cNvPr id="0" name="u1_L2_A.jpg"/>
+                          <pic:cNvPicPr/>
+                        </pic:nvPicPr>
+                        <pic:blipFill>
+                          <a:blip r:embed="rId21"/>
+                          <a:stretch>
+                            <a:fillRect/>
+                          </a:stretch>
+                        </pic:blipFill>
+                        <pic:spPr>
+                          <a:xfrm>
+                            <a:off x="0" y="0"/>
+                            <a:ext cx="1007999" cy="1007999"/>
+                          </a:xfrm>
+                          <a:prstGeom prst="rect"/>
+                        </pic:spPr>
+                      </pic:pic>
+                    </a:graphicData>
+                  </a:graphic>
+                </wp:inline>
+              </w:drawing>
+            </w:r>
+          </w:p>
+        </w:tc>
+        <w:tc>
+          <w:tcPr>
+            <w:tcW w:type="dxa" w:w="2550"/>
+          </w:tcPr>
+          <w:p>
+            <w:pPr>
+              <w:jc w:val="center"/>
+            </w:pPr>
+            <w:r>
+              <w:drawing>
+                <wp:inline xmlns:a="http://schemas.openxmlformats.org/drawingml/2006/main" xmlns:pic="http://schemas.openxmlformats.org/drawingml/2006/picture">
+                  <wp:extent cx="1007999" cy="1007999"/>
+                  <wp:docPr id="14" name="Picture 14"/>
+                  <wp:cNvGraphicFramePr>
+                    <a:graphicFrameLocks noChangeAspect="1"/>
+                  </wp:cNvGraphicFramePr>
+                  <a:graphic>
+                    <a:graphicData uri="http://schemas.openxmlformats.org/drawingml/2006/picture">
+                      <pic:pic>
+                        <pic:nvPicPr>
+                          <pic:cNvPr id="0" name="u1_L2_B.jpg"/>
+                          <pic:cNvPicPr/>
+                        </pic:nvPicPr>
+                        <pic:blipFill>
+                          <a:blip r:embed="rId22"/>
+                          <a:stretch>
+                            <a:fillRect/>
+                          </a:stretch>
+                        </pic:blipFill>
+                        <pic:spPr>
+                          <a:xfrm>
+                            <a:off x="0" y="0"/>
+                            <a:ext cx="1007999" cy="1007999"/>
+                          </a:xfrm>
+                          <a:prstGeom prst="rect"/>
+                        </pic:spPr>
+                      </pic:pic>
+                    </a:graphicData>
+                  </a:graphic>
+                </wp:inline>
+              </w:drawing>
+            </w:r>
+          </w:p>
+        </w:tc>
+        <w:tc>
+          <w:tcPr>
+            <w:tcW w:type="dxa" w:w="2550"/>
+          </w:tcPr>
+          <w:p>
+            <w:pPr>
+              <w:jc w:val="center"/>
+            </w:pPr>
+            <w:r>
+              <w:drawing>
+                <wp:inline xmlns:a="http://schemas.openxmlformats.org/drawingml/2006/main" xmlns:pic="http://schemas.openxmlformats.org/drawingml/2006/picture">
+                  <wp:extent cx="1007999" cy="1007999"/>
+                  <wp:docPr id="15" name="Picture 15"/>
+                  <wp:cNvGraphicFramePr>
+                    <a:graphicFrameLocks noChangeAspect="1"/>
+                  </wp:cNvGraphicFramePr>
+                  <a:graphic>
+                    <a:graphicData uri="http://schemas.openxmlformats.org/drawingml/2006/picture">
+                      <pic:pic>
+                        <pic:nvPicPr>
+                          <pic:cNvPr id="0" name="u1_L2_C.jpg"/>
+                          <pic:cNvPicPr/>
+                        </pic:nvPicPr>
+                        <pic:blipFill>
+                          <a:blip r:embed="rId23"/>
+                          <a:stretch>
+                            <a:fillRect/>
+                          </a:stretch>
+                        </pic:blipFill>
+                        <pic:spPr>
+                          <a:xfrm>
+                            <a:off x="0" y="0"/>
+                            <a:ext cx="1007999" cy="1007999"/>
+                          </a:xfrm>
+                          <a:prstGeom prst="rect"/>
+                        </pic:spPr>
+                      </pic:pic>
+                    </a:graphicData>
+                  </a:graphic>
+                </wp:inline>
+              </w:drawing>
+            </w:r>
+          </w:p>
+        </w:tc>
+        <w:tc>
+          <w:tcPr>
+            <w:tcW w:type="dxa" w:w="2550"/>
+          </w:tcPr>
+          <w:p>
+            <w:pPr>
+              <w:jc w:val="center"/>
+            </w:pPr>
+            <w:r>
+              <w:drawing>
+                <wp:inline xmlns:a="http://schemas.openxmlformats.org/drawingml/2006/main" xmlns:pic="http://schemas.openxmlformats.org/drawingml/2006/picture">
+                  <wp:extent cx="1007999" cy="1007999"/>
+                  <wp:docPr id="16" name="Picture 16"/>
+                  <wp:cNvGraphicFramePr>
+                    <a:graphicFrameLocks noChangeAspect="1"/>
+                  </wp:cNvGraphicFramePr>
+                  <a:graphic>
+                    <a:graphicData uri="http://schemas.openxmlformats.org/drawingml/2006/picture">
+                      <pic:pic>
+                        <pic:nvPicPr>
+                          <pic:cNvPr id="0" name="u1_L2_D.jpg"/>
+                          <pic:cNvPicPr/>
+                        </pic:nvPicPr>
+                        <pic:blipFill>
+                          <a:blip r:embed="rId24"/>
+                          <a:stretch>
+                            <a:fillRect/>
+                          </a:stretch>
+                        </pic:blipFill>
+                        <pic:spPr>
+                          <a:xfrm>
+                            <a:off x="0" y="0"/>
+                            <a:ext cx="1007999" cy="1007999"/>
+                          </a:xfrm>
+                          <a:prstGeom prst="rect"/>
+                        </pic:spPr>
+                      </pic:pic>
+                    </a:graphicData>
+                  </a:graphic>
+                </wp:inline>
+              </w:drawing>
+            </w:r>
+          </w:p>
+        </w:tc>
+      </w:tr>
+      <w:tr>
+        <w:tc>
+          <w:tcPr>
+            <w:tcW w:type="dxa" w:w="2550"/>
+          </w:tcPr>
+          <w:p>
+            <w:pPr>
+              <w:jc w:val="center"/>
+            </w:pPr>
+            <w:r>
+              <w:rPr>
+                <w:rFonts w:ascii="宋体" w:hAnsi="宋体" w:eastAsia="宋体"/>
+                <w:b w:val="0"/>
+                <w:sz w:val="18"/>
+              </w:rPr>
+              <w:t>A. 排序：____</w:t>
+            </w:r>
+          </w:p>
+        </w:tc>
+        <w:tc>
+          <w:tcPr>
+            <w:tcW w:type="dxa" w:w="2550"/>
+          </w:tcPr>
+          <w:p>
+            <w:pPr>
+              <w:jc w:val="center"/>
+            </w:pPr>
+            <w:r>
+              <w:rPr>
+                <w:rFonts w:ascii="宋体" w:hAnsi="宋体" w:eastAsia="宋体"/>
+                <w:b w:val="0"/>
+                <w:sz w:val="18"/>
+              </w:rPr>
+              <w:t>B. 排序：____</w:t>
+            </w:r>
+          </w:p>
+        </w:tc>
+        <w:tc>
+          <w:tcPr>
+            <w:tcW w:type="dxa" w:w="2550"/>
+          </w:tcPr>
+          <w:p>
+            <w:pPr>
+              <w:jc w:val="center"/>
+            </w:pPr>
+            <w:r>
+              <w:rPr>
+                <w:rFonts w:ascii="宋体" w:hAnsi="宋体" w:eastAsia="宋体"/>
+                <w:b w:val="0"/>
+                <w:sz w:val="18"/>
+              </w:rPr>
+              <w:t>C. 排序：____</w:t>
+            </w:r>
+          </w:p>
+        </w:tc>
+        <w:tc>
+          <w:tcPr>
+            <w:tcW w:type="dxa" w:w="2550"/>
+          </w:tcPr>
+          <w:p>
+            <w:pPr>
+              <w:jc w:val="center"/>
+            </w:pPr>
+            <w:r>
+              <w:rPr>
+                <w:rFonts w:ascii="宋体" w:hAnsi="宋体" w:eastAsia="宋体"/>
+                <w:b w:val="0"/>
+                <w:sz w:val="18"/>
+              </w:rPr>
+              <w:t>D. 排序：____</w:t>
+            </w:r>
+          </w:p>
+        </w:tc>
+      </w:tr>
+    </w:tbl>
     <w:p>
       <w:pPr>
-        <w:spacing w:after="80" w:before="0" w:line="240" w:lineRule="auto"/>
-      </w:pPr>
-      <w:r>
-        <w:rPr>
-          <w:rFonts w:ascii="宋体" w:hAnsi="宋体" w:eastAsia="宋体"/>
-          <w:b w:val="0"/>
-          <w:sz w:val="20"/>
-        </w:rPr>
-        <w:t xml:space="preserve">   □ A. 【图】男孩托腮若有所思/担忧    排序：____</w:t>
-      </w:r>
-    </w:p>
-    <w:p>
-      <w:pPr>
-        <w:spacing w:after="80" w:before="0" w:line="240" w:lineRule="auto"/>
-      </w:pPr>
-      <w:r>
-        <w:rPr>
-          <w:rFonts w:ascii="宋体" w:hAnsi="宋体" w:eastAsia="宋体"/>
-          <w:b w:val="0"/>
-          <w:sz w:val="20"/>
-        </w:rPr>
-        <w:t xml:space="preserve">   □ B. 【图】三个孩子在地板上一起玩    排序：____</w:t>
-      </w:r>
-    </w:p>
-    <w:p>
-      <w:pPr>
-        <w:spacing w:after="80" w:before="0" w:line="240" w:lineRule="auto"/>
-      </w:pPr>
-      <w:r>
-        <w:rPr>
-          <w:rFonts w:ascii="宋体" w:hAnsi="宋体" w:eastAsia="宋体"/>
-          <w:b w:val="0"/>
-          <w:sz w:val="20"/>
-        </w:rPr>
-        <w:t xml:space="preserve">   □ C. 【图】男孩坐在书桌前疲惫/难受    排序：____</w:t>
-      </w:r>
-    </w:p>
-    <w:p>
-      <w:pPr>
-        <w:spacing w:after="80" w:before="0" w:line="240" w:lineRule="auto"/>
-      </w:pPr>
-      <w:r>
-        <w:rPr>
-          <w:rFonts w:ascii="宋体" w:hAnsi="宋体" w:eastAsia="宋体"/>
-          <w:b w:val="0"/>
-          <w:sz w:val="20"/>
-        </w:rPr>
-        <w:t xml:space="preserve">   □ D. 【图】开心的背书包女孩（扎辫子）    排序：____</w:t>
-      </w:r>
-    </w:p>
-    <w:p>
-      <w:pPr>
-        <w:spacing w:after="120" w:before="200" w:line="240" w:lineRule="auto"/>
+        <w:spacing w:before="200" w:after="120" w:line="240" w:lineRule="auto"/>
       </w:pPr>
       <w:r>
         <w:rPr>
@@ -371,7 +1347,7 @@
     </w:p>
     <w:p>
       <w:pPr>
-        <w:spacing w:after="20" w:before="0" w:line="240" w:lineRule="auto"/>
+        <w:spacing w:before="0" w:after="20" w:line="240" w:lineRule="auto"/>
       </w:pPr>
       <w:r>
         <w:rPr>
@@ -384,7 +1360,7 @@
     </w:p>
     <w:p>
       <w:pPr>
-        <w:spacing w:after="20" w:before="0" w:line="240" w:lineRule="auto"/>
+        <w:spacing w:before="0" w:after="20" w:line="240" w:lineRule="auto"/>
       </w:pPr>
       <w:r>
         <w:rPr>
@@ -397,7 +1373,7 @@
     </w:p>
     <w:p>
       <w:pPr>
-        <w:spacing w:after="20" w:before="0" w:line="240" w:lineRule="auto"/>
+        <w:spacing w:before="0" w:after="20" w:line="240" w:lineRule="auto"/>
       </w:pPr>
       <w:r>
         <w:rPr>
@@ -410,7 +1386,7 @@
     </w:p>
     <w:p>
       <w:pPr>
-        <w:spacing w:after="20" w:before="0" w:line="240" w:lineRule="auto"/>
+        <w:spacing w:before="0" w:after="20" w:line="240" w:lineRule="auto"/>
       </w:pPr>
       <w:r>
         <w:rPr>
@@ -423,7 +1399,7 @@
     </w:p>
     <w:p>
       <w:pPr>
-        <w:spacing w:after="20" w:before="0" w:line="240" w:lineRule="auto"/>
+        <w:spacing w:before="0" w:after="20" w:line="240" w:lineRule="auto"/>
       </w:pPr>
       <w:r>
         <w:rPr>
@@ -436,7 +1412,7 @@
     </w:p>
     <w:p>
       <w:pPr>
-        <w:spacing w:after="20" w:before="0" w:line="240" w:lineRule="auto"/>
+        <w:spacing w:before="0" w:after="20" w:line="240" w:lineRule="auto"/>
       </w:pPr>
       <w:r>
         <w:rPr>
@@ -449,7 +1425,7 @@
     </w:p>
     <w:p>
       <w:pPr>
-        <w:spacing w:after="20" w:before="0" w:line="240" w:lineRule="auto"/>
+        <w:spacing w:before="0" w:after="20" w:line="240" w:lineRule="auto"/>
       </w:pPr>
       <w:r>
         <w:rPr>
@@ -462,7 +1438,7 @@
     </w:p>
     <w:p>
       <w:pPr>
-        <w:spacing w:after="20" w:before="0" w:line="240" w:lineRule="auto"/>
+        <w:spacing w:before="0" w:after="20" w:line="240" w:lineRule="auto"/>
       </w:pPr>
       <w:r>
         <w:rPr>
@@ -475,7 +1451,7 @@
     </w:p>
     <w:p>
       <w:pPr>
-        <w:spacing w:after="20" w:before="0" w:line="240" w:lineRule="auto"/>
+        <w:spacing w:before="0" w:after="20" w:line="240" w:lineRule="auto"/>
       </w:pPr>
       <w:r>
         <w:rPr>
@@ -488,7 +1464,7 @@
     </w:p>
     <w:p>
       <w:pPr>
-        <w:spacing w:after="20" w:before="0" w:line="240" w:lineRule="auto"/>
+        <w:spacing w:before="0" w:after="20" w:line="240" w:lineRule="auto"/>
       </w:pPr>
       <w:r>
         <w:rPr>
@@ -501,7 +1477,7 @@
     </w:p>
     <w:p>
       <w:pPr>
-        <w:spacing w:after="20" w:before="0" w:line="240" w:lineRule="auto"/>
+        <w:spacing w:before="0" w:after="20" w:line="240" w:lineRule="auto"/>
       </w:pPr>
       <w:r>
         <w:rPr>
@@ -514,7 +1490,7 @@
     </w:p>
     <w:p>
       <w:pPr>
-        <w:spacing w:after="20" w:before="0" w:line="240" w:lineRule="auto"/>
+        <w:spacing w:before="0" w:after="20" w:line="240" w:lineRule="auto"/>
       </w:pPr>
       <w:r>
         <w:rPr>
@@ -527,7 +1503,7 @@
     </w:p>
     <w:p>
       <w:pPr>
-        <w:spacing w:after="20" w:before="0" w:line="240" w:lineRule="auto"/>
+        <w:spacing w:before="0" w:after="20" w:line="240" w:lineRule="auto"/>
       </w:pPr>
       <w:r>
         <w:rPr>
@@ -540,7 +1516,7 @@
     </w:p>
     <w:p>
       <w:pPr>
-        <w:spacing w:after="20" w:before="0" w:line="240" w:lineRule="auto"/>
+        <w:spacing w:before="0" w:after="20" w:line="240" w:lineRule="auto"/>
       </w:pPr>
       <w:r>
         <w:rPr>
@@ -553,7 +1529,7 @@
     </w:p>
     <w:p>
       <w:pPr>
-        <w:spacing w:after="20" w:before="0" w:line="240" w:lineRule="auto"/>
+        <w:spacing w:before="0" w:after="20" w:line="240" w:lineRule="auto"/>
       </w:pPr>
       <w:r>
         <w:rPr>
@@ -566,7 +1542,7 @@
     </w:p>
     <w:p>
       <w:pPr>
-        <w:spacing w:after="40" w:before="240" w:line="240" w:lineRule="auto"/>
+        <w:spacing w:before="200" w:after="40" w:line="240" w:lineRule="auto"/>
         <w:jc w:val="center"/>
       </w:pPr>
       <w:r>
@@ -575,7 +1551,7 @@
           <w:b w:val="0"/>
           <w:sz w:val="18"/>
         </w:rPr>
-        <w:t>英语 · 四上 · 第一单元  第 1 页（共 4 页）</w:t>
+        <w:t>英语 · 四上 · 第一单元  第 1 页（共 4 页）· 高清图题版</w:t>
       </w:r>
     </w:p>
     <w:p>
@@ -585,7 +1561,7 @@
     </w:p>
     <w:p>
       <w:pPr>
-        <w:spacing w:after="120" w:before="200" w:line="240" w:lineRule="auto"/>
+        <w:spacing w:before="200" w:after="120" w:line="240" w:lineRule="auto"/>
       </w:pPr>
       <w:r>
         <w:rPr>
@@ -598,7 +1574,7 @@
     </w:p>
     <w:p>
       <w:pPr>
-        <w:spacing w:after="80" w:before="0" w:line="240" w:lineRule="auto"/>
+        <w:spacing w:before="0" w:after="60" w:line="240" w:lineRule="auto"/>
       </w:pPr>
       <w:r>
         <w:rPr>
@@ -611,7 +1587,7 @@
     </w:p>
     <w:p>
       <w:pPr>
-        <w:spacing w:after="80" w:before="0" w:line="240" w:lineRule="auto"/>
+        <w:spacing w:before="0" w:after="60" w:line="240" w:lineRule="auto"/>
       </w:pPr>
       <w:r>
         <w:rPr>
@@ -624,7 +1600,7 @@
     </w:p>
     <w:p>
       <w:pPr>
-        <w:spacing w:after="80" w:before="0" w:line="240" w:lineRule="auto"/>
+        <w:spacing w:before="0" w:after="60" w:line="240" w:lineRule="auto"/>
       </w:pPr>
       <w:r>
         <w:rPr>
@@ -637,7 +1613,7 @@
     </w:p>
     <w:p>
       <w:pPr>
-        <w:spacing w:after="80" w:before="0" w:line="240" w:lineRule="auto"/>
+        <w:spacing w:before="0" w:after="60" w:line="240" w:lineRule="auto"/>
       </w:pPr>
       <w:r>
         <w:rPr>
@@ -650,7 +1626,7 @@
     </w:p>
     <w:p>
       <w:pPr>
-        <w:spacing w:after="80" w:before="0" w:line="240" w:lineRule="auto"/>
+        <w:spacing w:before="0" w:after="60" w:line="240" w:lineRule="auto"/>
       </w:pPr>
       <w:r>
         <w:rPr>
@@ -663,7 +1639,7 @@
     </w:p>
     <w:p>
       <w:pPr>
-        <w:spacing w:after="160" w:before="240" w:line="240" w:lineRule="auto"/>
+        <w:spacing w:before="200" w:after="160" w:line="240" w:lineRule="auto"/>
         <w:jc w:val="center"/>
       </w:pPr>
       <w:r>
@@ -677,7 +1653,7 @@
     </w:p>
     <w:p>
       <w:pPr>
-        <w:spacing w:after="120" w:before="200" w:line="240" w:lineRule="auto"/>
+        <w:spacing w:before="200" w:after="120" w:line="240" w:lineRule="auto"/>
       </w:pPr>
       <w:r>
         <w:rPr>
@@ -931,7 +1907,7 @@
     </w:p>
     <w:p>
       <w:pPr>
-        <w:spacing w:after="120" w:before="200" w:line="240" w:lineRule="auto"/>
+        <w:spacing w:before="200" w:after="120" w:line="240" w:lineRule="auto"/>
       </w:pPr>
       <w:r>
         <w:rPr>
@@ -944,7 +1920,7 @@
     </w:p>
     <w:p>
       <w:pPr>
-        <w:spacing w:after="120" w:before="0" w:line="240" w:lineRule="auto"/>
+        <w:spacing w:before="0" w:after="80" w:line="240" w:lineRule="auto"/>
       </w:pPr>
       <w:r>
         <w:rPr>
@@ -957,7 +1933,7 @@
     </w:p>
     <w:p>
       <w:pPr>
-        <w:spacing w:after="80" w:before="0" w:line="240" w:lineRule="auto"/>
+        <w:spacing w:before="0" w:after="60" w:line="240" w:lineRule="auto"/>
       </w:pPr>
       <w:r>
         <w:rPr>
@@ -970,7 +1946,7 @@
     </w:p>
     <w:p>
       <w:pPr>
-        <w:spacing w:after="80" w:before="0" w:line="240" w:lineRule="auto"/>
+        <w:spacing w:before="0" w:after="60" w:line="240" w:lineRule="auto"/>
       </w:pPr>
       <w:r>
         <w:rPr>
@@ -983,7 +1959,7 @@
     </w:p>
     <w:p>
       <w:pPr>
-        <w:spacing w:after="120" w:before="0" w:line="240" w:lineRule="auto"/>
+        <w:spacing w:before="0" w:after="80" w:line="240" w:lineRule="auto"/>
       </w:pPr>
       <w:r>
         <w:rPr>
@@ -996,7 +1972,7 @@
     </w:p>
     <w:p>
       <w:pPr>
-        <w:spacing w:after="120" w:before="200" w:line="240" w:lineRule="auto"/>
+        <w:spacing w:before="200" w:after="120" w:line="240" w:lineRule="auto"/>
       </w:pPr>
       <w:r>
         <w:rPr>
@@ -1009,7 +1985,7 @@
     </w:p>
     <w:p>
       <w:pPr>
-        <w:spacing w:after="40" w:before="0" w:line="240" w:lineRule="auto"/>
+        <w:spacing w:before="0" w:after="20" w:line="240" w:lineRule="auto"/>
       </w:pPr>
       <w:r>
         <w:rPr>
@@ -1022,7 +1998,7 @@
     </w:p>
     <w:p>
       <w:pPr>
-        <w:spacing w:after="40" w:before="0" w:line="240" w:lineRule="auto"/>
+        <w:spacing w:before="0" w:after="20" w:line="240" w:lineRule="auto"/>
       </w:pPr>
       <w:r>
         <w:rPr>
@@ -1035,7 +2011,7 @@
     </w:p>
     <w:p>
       <w:pPr>
-        <w:spacing w:after="40" w:before="0" w:line="240" w:lineRule="auto"/>
+        <w:spacing w:before="0" w:after="20" w:line="240" w:lineRule="auto"/>
       </w:pPr>
       <w:r>
         <w:rPr>
@@ -1048,7 +2024,7 @@
     </w:p>
     <w:p>
       <w:pPr>
-        <w:spacing w:after="40" w:before="0" w:line="240" w:lineRule="auto"/>
+        <w:spacing w:before="0" w:after="20" w:line="240" w:lineRule="auto"/>
       </w:pPr>
       <w:r>
         <w:rPr>
@@ -1061,7 +2037,7 @@
     </w:p>
     <w:p>
       <w:pPr>
-        <w:spacing w:after="120" w:before="0" w:line="240" w:lineRule="auto"/>
+        <w:spacing w:before="0" w:after="20" w:line="240" w:lineRule="auto"/>
       </w:pPr>
       <w:r>
         <w:rPr>
@@ -1072,74 +2048,336 @@
         <w:t>E. Peter is happy, because he plays basketball with his friends.</w:t>
       </w:r>
     </w:p>
+    <w:tbl>
+      <w:tblPr>
+        <w:tblW w:type="auto" w:w="0"/>
+        <w:tblLook w:firstColumn="1" w:firstRow="1" w:lastColumn="0" w:lastRow="0" w:noHBand="0" w:noVBand="1" w:val="04A0"/>
+      </w:tblPr>
+      <w:tblGrid>
+        <w:gridCol w:w="2040"/>
+        <w:gridCol w:w="2040"/>
+        <w:gridCol w:w="2040"/>
+        <w:gridCol w:w="2040"/>
+        <w:gridCol w:w="2040"/>
+      </w:tblGrid>
+      <w:tr>
+        <w:tc>
+          <w:tcPr>
+            <w:tcW w:type="dxa" w:w="2040"/>
+          </w:tcPr>
+          <w:p>
+            <w:pPr>
+              <w:jc w:val="center"/>
+            </w:pPr>
+            <w:r>
+              <w:drawing>
+                <wp:inline xmlns:a="http://schemas.openxmlformats.org/drawingml/2006/main" xmlns:pic="http://schemas.openxmlformats.org/drawingml/2006/picture">
+                  <wp:extent cx="936000" cy="936000"/>
+                  <wp:docPr id="17" name="Picture 17"/>
+                  <wp:cNvGraphicFramePr>
+                    <a:graphicFrameLocks noChangeAspect="1"/>
+                  </wp:cNvGraphicFramePr>
+                  <a:graphic>
+                    <a:graphicData uri="http://schemas.openxmlformats.org/drawingml/2006/picture">
+                      <pic:pic>
+                        <pic:nvPicPr>
+                          <pic:cNvPr id="0" name="u1_W7_1.jpg"/>
+                          <pic:cNvPicPr/>
+                        </pic:nvPicPr>
+                        <pic:blipFill>
+                          <a:blip r:embed="rId25"/>
+                          <a:stretch>
+                            <a:fillRect/>
+                          </a:stretch>
+                        </pic:blipFill>
+                        <pic:spPr>
+                          <a:xfrm>
+                            <a:off x="0" y="0"/>
+                            <a:ext cx="936000" cy="936000"/>
+                          </a:xfrm>
+                          <a:prstGeom prst="rect"/>
+                        </pic:spPr>
+                      </pic:pic>
+                    </a:graphicData>
+                  </a:graphic>
+                </wp:inline>
+              </w:drawing>
+            </w:r>
+          </w:p>
+        </w:tc>
+        <w:tc>
+          <w:tcPr>
+            <w:tcW w:type="dxa" w:w="2040"/>
+          </w:tcPr>
+          <w:p>
+            <w:pPr>
+              <w:jc w:val="center"/>
+            </w:pPr>
+            <w:r>
+              <w:drawing>
+                <wp:inline xmlns:a="http://schemas.openxmlformats.org/drawingml/2006/main" xmlns:pic="http://schemas.openxmlformats.org/drawingml/2006/picture">
+                  <wp:extent cx="936000" cy="936000"/>
+                  <wp:docPr id="18" name="Picture 18"/>
+                  <wp:cNvGraphicFramePr>
+                    <a:graphicFrameLocks noChangeAspect="1"/>
+                  </wp:cNvGraphicFramePr>
+                  <a:graphic>
+                    <a:graphicData uri="http://schemas.openxmlformats.org/drawingml/2006/picture">
+                      <pic:pic>
+                        <pic:nvPicPr>
+                          <pic:cNvPr id="0" name="u1_W7_2.jpg"/>
+                          <pic:cNvPicPr/>
+                        </pic:nvPicPr>
+                        <pic:blipFill>
+                          <a:blip r:embed="rId26"/>
+                          <a:stretch>
+                            <a:fillRect/>
+                          </a:stretch>
+                        </pic:blipFill>
+                        <pic:spPr>
+                          <a:xfrm>
+                            <a:off x="0" y="0"/>
+                            <a:ext cx="936000" cy="936000"/>
+                          </a:xfrm>
+                          <a:prstGeom prst="rect"/>
+                        </pic:spPr>
+                      </pic:pic>
+                    </a:graphicData>
+                  </a:graphic>
+                </wp:inline>
+              </w:drawing>
+            </w:r>
+          </w:p>
+        </w:tc>
+        <w:tc>
+          <w:tcPr>
+            <w:tcW w:type="dxa" w:w="2040"/>
+          </w:tcPr>
+          <w:p>
+            <w:pPr>
+              <w:jc w:val="center"/>
+            </w:pPr>
+            <w:r>
+              <w:drawing>
+                <wp:inline xmlns:a="http://schemas.openxmlformats.org/drawingml/2006/main" xmlns:pic="http://schemas.openxmlformats.org/drawingml/2006/picture">
+                  <wp:extent cx="936000" cy="936000"/>
+                  <wp:docPr id="19" name="Picture 19"/>
+                  <wp:cNvGraphicFramePr>
+                    <a:graphicFrameLocks noChangeAspect="1"/>
+                  </wp:cNvGraphicFramePr>
+                  <a:graphic>
+                    <a:graphicData uri="http://schemas.openxmlformats.org/drawingml/2006/picture">
+                      <pic:pic>
+                        <pic:nvPicPr>
+                          <pic:cNvPr id="0" name="u1_W7_3.jpg"/>
+                          <pic:cNvPicPr/>
+                        </pic:nvPicPr>
+                        <pic:blipFill>
+                          <a:blip r:embed="rId27"/>
+                          <a:stretch>
+                            <a:fillRect/>
+                          </a:stretch>
+                        </pic:blipFill>
+                        <pic:spPr>
+                          <a:xfrm>
+                            <a:off x="0" y="0"/>
+                            <a:ext cx="936000" cy="936000"/>
+                          </a:xfrm>
+                          <a:prstGeom prst="rect"/>
+                        </pic:spPr>
+                      </pic:pic>
+                    </a:graphicData>
+                  </a:graphic>
+                </wp:inline>
+              </w:drawing>
+            </w:r>
+          </w:p>
+        </w:tc>
+        <w:tc>
+          <w:tcPr>
+            <w:tcW w:type="dxa" w:w="2040"/>
+          </w:tcPr>
+          <w:p>
+            <w:pPr>
+              <w:jc w:val="center"/>
+            </w:pPr>
+            <w:r>
+              <w:drawing>
+                <wp:inline xmlns:a="http://schemas.openxmlformats.org/drawingml/2006/main" xmlns:pic="http://schemas.openxmlformats.org/drawingml/2006/picture">
+                  <wp:extent cx="936000" cy="936000"/>
+                  <wp:docPr id="20" name="Picture 20"/>
+                  <wp:cNvGraphicFramePr>
+                    <a:graphicFrameLocks noChangeAspect="1"/>
+                  </wp:cNvGraphicFramePr>
+                  <a:graphic>
+                    <a:graphicData uri="http://schemas.openxmlformats.org/drawingml/2006/picture">
+                      <pic:pic>
+                        <pic:nvPicPr>
+                          <pic:cNvPr id="0" name="u1_W7_4.jpg"/>
+                          <pic:cNvPicPr/>
+                        </pic:nvPicPr>
+                        <pic:blipFill>
+                          <a:blip r:embed="rId28"/>
+                          <a:stretch>
+                            <a:fillRect/>
+                          </a:stretch>
+                        </pic:blipFill>
+                        <pic:spPr>
+                          <a:xfrm>
+                            <a:off x="0" y="0"/>
+                            <a:ext cx="936000" cy="936000"/>
+                          </a:xfrm>
+                          <a:prstGeom prst="rect"/>
+                        </pic:spPr>
+                      </pic:pic>
+                    </a:graphicData>
+                  </a:graphic>
+                </wp:inline>
+              </w:drawing>
+            </w:r>
+          </w:p>
+        </w:tc>
+        <w:tc>
+          <w:tcPr>
+            <w:tcW w:type="dxa" w:w="2040"/>
+          </w:tcPr>
+          <w:p>
+            <w:pPr>
+              <w:jc w:val="center"/>
+            </w:pPr>
+            <w:r>
+              <w:drawing>
+                <wp:inline xmlns:a="http://schemas.openxmlformats.org/drawingml/2006/main" xmlns:pic="http://schemas.openxmlformats.org/drawingml/2006/picture">
+                  <wp:extent cx="936000" cy="936000"/>
+                  <wp:docPr id="21" name="Picture 21"/>
+                  <wp:cNvGraphicFramePr>
+                    <a:graphicFrameLocks noChangeAspect="1"/>
+                  </wp:cNvGraphicFramePr>
+                  <a:graphic>
+                    <a:graphicData uri="http://schemas.openxmlformats.org/drawingml/2006/picture">
+                      <pic:pic>
+                        <pic:nvPicPr>
+                          <pic:cNvPr id="0" name="u1_W7_5.jpg"/>
+                          <pic:cNvPicPr/>
+                        </pic:nvPicPr>
+                        <pic:blipFill>
+                          <a:blip r:embed="rId29"/>
+                          <a:stretch>
+                            <a:fillRect/>
+                          </a:stretch>
+                        </pic:blipFill>
+                        <pic:spPr>
+                          <a:xfrm>
+                            <a:off x="0" y="0"/>
+                            <a:ext cx="936000" cy="936000"/>
+                          </a:xfrm>
+                          <a:prstGeom prst="rect"/>
+                        </pic:spPr>
+                      </pic:pic>
+                    </a:graphicData>
+                  </a:graphic>
+                </wp:inline>
+              </w:drawing>
+            </w:r>
+          </w:p>
+        </w:tc>
+      </w:tr>
+      <w:tr>
+        <w:tc>
+          <w:tcPr>
+            <w:tcW w:type="dxa" w:w="2040"/>
+          </w:tcPr>
+          <w:p>
+            <w:pPr>
+              <w:jc w:val="center"/>
+            </w:pPr>
+            <w:r>
+              <w:rPr>
+                <w:rFonts w:ascii="宋体" w:hAnsi="宋体" w:eastAsia="宋体"/>
+                <w:b w:val="0"/>
+                <w:sz w:val="20"/>
+              </w:rPr>
+              <w:t>(  ) 1.</w:t>
+            </w:r>
+          </w:p>
+        </w:tc>
+        <w:tc>
+          <w:tcPr>
+            <w:tcW w:type="dxa" w:w="2040"/>
+          </w:tcPr>
+          <w:p>
+            <w:pPr>
+              <w:jc w:val="center"/>
+            </w:pPr>
+            <w:r>
+              <w:rPr>
+                <w:rFonts w:ascii="宋体" w:hAnsi="宋体" w:eastAsia="宋体"/>
+                <w:b w:val="0"/>
+                <w:sz w:val="20"/>
+              </w:rPr>
+              <w:t>(  ) 2.</w:t>
+            </w:r>
+          </w:p>
+        </w:tc>
+        <w:tc>
+          <w:tcPr>
+            <w:tcW w:type="dxa" w:w="2040"/>
+          </w:tcPr>
+          <w:p>
+            <w:pPr>
+              <w:jc w:val="center"/>
+            </w:pPr>
+            <w:r>
+              <w:rPr>
+                <w:rFonts w:ascii="宋体" w:hAnsi="宋体" w:eastAsia="宋体"/>
+                <w:b w:val="0"/>
+                <w:sz w:val="20"/>
+              </w:rPr>
+              <w:t>(  ) 3.</w:t>
+            </w:r>
+          </w:p>
+        </w:tc>
+        <w:tc>
+          <w:tcPr>
+            <w:tcW w:type="dxa" w:w="2040"/>
+          </w:tcPr>
+          <w:p>
+            <w:pPr>
+              <w:jc w:val="center"/>
+            </w:pPr>
+            <w:r>
+              <w:rPr>
+                <w:rFonts w:ascii="宋体" w:hAnsi="宋体" w:eastAsia="宋体"/>
+                <w:b w:val="0"/>
+                <w:sz w:val="20"/>
+              </w:rPr>
+              <w:t>(  ) 4.</w:t>
+            </w:r>
+          </w:p>
+        </w:tc>
+        <w:tc>
+          <w:tcPr>
+            <w:tcW w:type="dxa" w:w="2040"/>
+          </w:tcPr>
+          <w:p>
+            <w:pPr>
+              <w:jc w:val="center"/>
+            </w:pPr>
+            <w:r>
+              <w:rPr>
+                <w:rFonts w:ascii="宋体" w:hAnsi="宋体" w:eastAsia="宋体"/>
+                <w:b w:val="0"/>
+                <w:sz w:val="20"/>
+              </w:rPr>
+              <w:t>(  ) 5.</w:t>
+            </w:r>
+          </w:p>
+        </w:tc>
+      </w:tr>
+    </w:tbl>
     <w:p>
       <w:pPr>
-        <w:spacing w:after="60" w:before="0" w:line="240" w:lineRule="auto"/>
-      </w:pPr>
-      <w:r>
-        <w:rPr>
-          <w:rFonts w:ascii="宋体" w:hAnsi="宋体" w:eastAsia="宋体"/>
-          <w:b w:val="0"/>
-          <w:sz w:val="20"/>
-        </w:rPr>
-        <w:t>(  ) 1. 【图】孩子们在 Amusement Park 门口</w:t>
-      </w:r>
-    </w:p>
-    <w:p>
-      <w:pPr>
-        <w:spacing w:after="60" w:before="0" w:line="240" w:lineRule="auto"/>
-      </w:pPr>
-      <w:r>
-        <w:rPr>
-          <w:rFonts w:ascii="宋体" w:hAnsi="宋体" w:eastAsia="宋体"/>
-          <w:b w:val="0"/>
-          <w:sz w:val="20"/>
-        </w:rPr>
-        <w:t>(  ) 2. 【图】女士站在猫和打碎的花瓶旁</w:t>
-      </w:r>
-    </w:p>
-    <w:p>
-      <w:pPr>
-        <w:spacing w:after="60" w:before="0" w:line="240" w:lineRule="auto"/>
-      </w:pPr>
-      <w:r>
-        <w:rPr>
-          <w:rFonts w:ascii="宋体" w:hAnsi="宋体" w:eastAsia="宋体"/>
-          <w:b w:val="0"/>
-          <w:sz w:val="20"/>
-        </w:rPr>
-        <w:t>(  ) 3. 【图】三个孩子打篮球</w:t>
-      </w:r>
-    </w:p>
-    <w:p>
-      <w:pPr>
-        <w:spacing w:after="60" w:before="0" w:line="240" w:lineRule="auto"/>
-      </w:pPr>
-      <w:r>
-        <w:rPr>
-          <w:rFonts w:ascii="宋体" w:hAnsi="宋体" w:eastAsia="宋体"/>
-          <w:b w:val="0"/>
-          <w:sz w:val="20"/>
-        </w:rPr>
-        <w:t>(  ) 4. 【图】男孩在哭，思想泡泡里是丢失的红围巾</w:t>
-      </w:r>
-    </w:p>
-    <w:p>
-      <w:pPr>
-        <w:spacing w:after="60" w:before="0" w:line="240" w:lineRule="auto"/>
-      </w:pPr>
-      <w:r>
-        <w:rPr>
-          <w:rFonts w:ascii="宋体" w:hAnsi="宋体" w:eastAsia="宋体"/>
-          <w:b w:val="0"/>
-          <w:sz w:val="20"/>
-        </w:rPr>
-        <w:t>(  ) 5. 【图】女士站在病床旁的老人身边</w:t>
-      </w:r>
-    </w:p>
-    <w:p>
-      <w:pPr>
-        <w:spacing w:after="40" w:before="240" w:line="240" w:lineRule="auto"/>
+        <w:spacing w:before="200" w:after="40" w:line="240" w:lineRule="auto"/>
         <w:jc w:val="center"/>
       </w:pPr>
       <w:r>
@@ -1148,7 +2386,7 @@
           <w:b w:val="0"/>
           <w:sz w:val="18"/>
         </w:rPr>
-        <w:t>英语 · 四上 · 第一单元  第 2 页（共 4 页）</w:t>
+        <w:t>英语 · 四上 · 第一单元  第 2 页（共 4 页）· 高清图题版</w:t>
       </w:r>
     </w:p>
     <w:p>
@@ -1158,7 +2396,7 @@
     </w:p>
     <w:p>
       <w:pPr>
-        <w:spacing w:after="120" w:before="200" w:line="240" w:lineRule="auto"/>
+        <w:spacing w:before="200" w:after="120" w:line="240" w:lineRule="auto"/>
       </w:pPr>
       <w:r>
         <w:rPr>
@@ -1171,7 +2409,7 @@
     </w:p>
     <w:p>
       <w:pPr>
-        <w:spacing w:after="20" w:before="0" w:line="240" w:lineRule="auto"/>
+        <w:spacing w:before="0" w:after="20" w:line="240" w:lineRule="auto"/>
       </w:pPr>
       <w:r>
         <w:rPr>
@@ -1184,7 +2422,7 @@
     </w:p>
     <w:p>
       <w:pPr>
-        <w:spacing w:after="20" w:before="0" w:line="240" w:lineRule="auto"/>
+        <w:spacing w:before="0" w:after="20" w:line="240" w:lineRule="auto"/>
       </w:pPr>
       <w:r>
         <w:rPr>
@@ -1197,7 +2435,7 @@
     </w:p>
     <w:p>
       <w:pPr>
-        <w:spacing w:after="20" w:before="0" w:line="240" w:lineRule="auto"/>
+        <w:spacing w:before="0" w:after="20" w:line="240" w:lineRule="auto"/>
       </w:pPr>
       <w:r>
         <w:rPr>
@@ -1210,7 +2448,7 @@
     </w:p>
     <w:p>
       <w:pPr>
-        <w:spacing w:after="20" w:before="0" w:line="240" w:lineRule="auto"/>
+        <w:spacing w:before="0" w:after="20" w:line="240" w:lineRule="auto"/>
       </w:pPr>
       <w:r>
         <w:rPr>
@@ -1223,7 +2461,7 @@
     </w:p>
     <w:p>
       <w:pPr>
-        <w:spacing w:after="120" w:before="0" w:line="240" w:lineRule="auto"/>
+        <w:spacing w:before="0" w:after="20" w:line="240" w:lineRule="auto"/>
       </w:pPr>
       <w:r>
         <w:rPr>
@@ -1236,7 +2474,7 @@
     </w:p>
     <w:p>
       <w:pPr>
-        <w:spacing w:after="80" w:before="0" w:line="240" w:lineRule="auto"/>
+        <w:spacing w:before="0" w:after="60" w:line="240" w:lineRule="auto"/>
       </w:pPr>
       <w:r>
         <w:rPr>
@@ -1249,7 +2487,7 @@
     </w:p>
     <w:p>
       <w:pPr>
-        <w:spacing w:after="80" w:before="0" w:line="240" w:lineRule="auto"/>
+        <w:spacing w:before="0" w:after="60" w:line="240" w:lineRule="auto"/>
       </w:pPr>
       <w:r>
         <w:rPr>
@@ -1262,7 +2500,7 @@
     </w:p>
     <w:p>
       <w:pPr>
-        <w:spacing w:after="80" w:before="0" w:line="240" w:lineRule="auto"/>
+        <w:spacing w:before="0" w:after="60" w:line="240" w:lineRule="auto"/>
       </w:pPr>
       <w:r>
         <w:rPr>
@@ -1275,7 +2513,7 @@
     </w:p>
     <w:p>
       <w:pPr>
-        <w:spacing w:after="80" w:before="0" w:line="240" w:lineRule="auto"/>
+        <w:spacing w:before="0" w:after="60" w:line="240" w:lineRule="auto"/>
       </w:pPr>
       <w:r>
         <w:rPr>
@@ -1288,7 +2526,7 @@
     </w:p>
     <w:p>
       <w:pPr>
-        <w:spacing w:after="80" w:before="0" w:line="240" w:lineRule="auto"/>
+        <w:spacing w:before="0" w:after="60" w:line="240" w:lineRule="auto"/>
       </w:pPr>
       <w:r>
         <w:rPr>
@@ -1301,7 +2539,7 @@
     </w:p>
     <w:p>
       <w:pPr>
-        <w:spacing w:after="120" w:before="200" w:line="240" w:lineRule="auto"/>
+        <w:spacing w:before="200" w:after="120" w:line="240" w:lineRule="auto"/>
       </w:pPr>
       <w:r>
         <w:rPr>
@@ -1314,7 +2552,7 @@
     </w:p>
     <w:p>
       <w:pPr>
-        <w:spacing w:after="20" w:before="0" w:line="240" w:lineRule="auto"/>
+        <w:spacing w:before="0" w:after="20" w:line="240" w:lineRule="auto"/>
       </w:pPr>
       <w:r>
         <w:rPr>
@@ -1327,7 +2565,7 @@
     </w:p>
     <w:p>
       <w:pPr>
-        <w:spacing w:after="20" w:before="0" w:line="240" w:lineRule="auto"/>
+        <w:spacing w:before="0" w:after="20" w:line="240" w:lineRule="auto"/>
       </w:pPr>
       <w:r>
         <w:rPr>
@@ -1340,7 +2578,7 @@
     </w:p>
     <w:p>
       <w:pPr>
-        <w:spacing w:after="20" w:before="0" w:line="240" w:lineRule="auto"/>
+        <w:spacing w:before="0" w:after="20" w:line="240" w:lineRule="auto"/>
       </w:pPr>
       <w:r>
         <w:rPr>
@@ -1353,7 +2591,7 @@
     </w:p>
     <w:p>
       <w:pPr>
-        <w:spacing w:after="20" w:before="0" w:line="240" w:lineRule="auto"/>
+        <w:spacing w:before="0" w:after="20" w:line="240" w:lineRule="auto"/>
       </w:pPr>
       <w:r>
         <w:rPr>
@@ -1366,7 +2604,7 @@
     </w:p>
     <w:p>
       <w:pPr>
-        <w:spacing w:after="20" w:before="0" w:line="240" w:lineRule="auto"/>
+        <w:spacing w:before="0" w:after="20" w:line="240" w:lineRule="auto"/>
       </w:pPr>
       <w:r>
         <w:rPr>
@@ -1379,19 +2617,7 @@
     </w:p>
     <w:p>
       <w:pPr>
-        <w:spacing w:after="40" w:before="0" w:line="240" w:lineRule="auto"/>
-      </w:pPr>
-      <w:r>
-        <w:rPr>
-          <w:rFonts w:ascii="宋体" w:hAnsi="宋体" w:eastAsia="宋体"/>
-          <w:b w:val="0"/>
-          <w:sz w:val="20"/>
-        </w:rPr>
-      </w:r>
-    </w:p>
-    <w:p>
-      <w:pPr>
-        <w:spacing w:after="60" w:before="0" w:line="240" w:lineRule="auto"/>
+        <w:spacing w:before="0" w:after="40" w:line="240" w:lineRule="auto"/>
       </w:pPr>
       <w:r>
         <w:rPr>
@@ -1404,7 +2630,7 @@
     </w:p>
     <w:p>
       <w:pPr>
-        <w:spacing w:after="60" w:before="0" w:line="240" w:lineRule="auto"/>
+        <w:spacing w:before="0" w:after="40" w:line="240" w:lineRule="auto"/>
       </w:pPr>
       <w:r>
         <w:rPr>
@@ -1417,7 +2643,7 @@
     </w:p>
     <w:p>
       <w:pPr>
-        <w:spacing w:after="60" w:before="0" w:line="240" w:lineRule="auto"/>
+        <w:spacing w:before="0" w:after="40" w:line="240" w:lineRule="auto"/>
       </w:pPr>
       <w:r>
         <w:rPr>
@@ -1430,7 +2656,7 @@
     </w:p>
     <w:p>
       <w:pPr>
-        <w:spacing w:after="60" w:before="0" w:line="240" w:lineRule="auto"/>
+        <w:spacing w:before="0" w:after="40" w:line="240" w:lineRule="auto"/>
       </w:pPr>
       <w:r>
         <w:rPr>
@@ -1443,7 +2669,7 @@
     </w:p>
     <w:p>
       <w:pPr>
-        <w:spacing w:after="60" w:before="0" w:line="240" w:lineRule="auto"/>
+        <w:spacing w:before="0" w:after="40" w:line="240" w:lineRule="auto"/>
       </w:pPr>
       <w:r>
         <w:rPr>
@@ -1456,7 +2682,7 @@
     </w:p>
     <w:p>
       <w:pPr>
-        <w:spacing w:after="60" w:before="0" w:line="240" w:lineRule="auto"/>
+        <w:spacing w:before="0" w:after="40" w:line="240" w:lineRule="auto"/>
       </w:pPr>
       <w:r>
         <w:rPr>
@@ -1469,7 +2695,7 @@
     </w:p>
     <w:p>
       <w:pPr>
-        <w:spacing w:after="60" w:before="0" w:line="240" w:lineRule="auto"/>
+        <w:spacing w:before="0" w:after="40" w:line="240" w:lineRule="auto"/>
       </w:pPr>
       <w:r>
         <w:rPr>
@@ -1482,7 +2708,7 @@
     </w:p>
     <w:p>
       <w:pPr>
-        <w:spacing w:after="120" w:before="200" w:line="240" w:lineRule="auto"/>
+        <w:spacing w:before="200" w:after="120" w:line="240" w:lineRule="auto"/>
       </w:pPr>
       <w:r>
         <w:rPr>
@@ -1495,7 +2721,7 @@
     </w:p>
     <w:p>
       <w:pPr>
-        <w:spacing w:after="120" w:before="0" w:line="240" w:lineRule="auto"/>
+        <w:spacing w:before="0" w:after="80" w:line="240" w:lineRule="auto"/>
         <w:jc w:val="center"/>
       </w:pPr>
       <w:r>
@@ -1509,8 +2735,7 @@
     </w:p>
     <w:p>
       <w:pPr>
-        <w:spacing w:after="120" w:before="0" w:line="240" w:lineRule="auto"/>
-        <w:ind w:firstLine="420"/>
+        <w:spacing w:before="0" w:after="120" w:line="240" w:lineRule="auto"/>
       </w:pPr>
       <w:r>
         <w:rPr>
@@ -1518,68 +2743,12 @@
           <w:b w:val="0"/>
           <w:sz w:val="22"/>
         </w:rPr>
-        <w:t>I'm happy when the sun is shining. I can go outside and play with my friends. We can ride our bikes, fly kites, or play catch(接球游戏). The warm sun makes me feel good.</w:t>
+        <w:t>I'm happy when the sun is shining. I can go outside and play with my friends. We can ride our bikes, fly kites, or play catch(接球游戏). The warm sun makes me feel good. I'm happy when I'm with my family. We eat dinner together, talk and laugh. I'm happy when I read a good book. It's like having an adventure(冒险) in my mind. I'm happy when I help others and see a smile on his face.</w:t>
       </w:r>
     </w:p>
     <w:p>
       <w:pPr>
-        <w:spacing w:after="120" w:before="0" w:line="240" w:lineRule="auto"/>
-        <w:ind w:firstLine="420"/>
-      </w:pPr>
-      <w:r>
-        <w:rPr>
-          <w:rFonts w:ascii="宋体" w:hAnsi="宋体" w:eastAsia="宋体"/>
-          <w:b w:val="0"/>
-          <w:sz w:val="22"/>
-        </w:rPr>
-        <w:t>I'm happy when I'm with my family. We eat dinner together, talk and laugh. My parents tell me stories, and I feel safe and loved.</w:t>
-      </w:r>
-    </w:p>
-    <w:p>
-      <w:pPr>
-        <w:spacing w:after="120" w:before="0" w:line="240" w:lineRule="auto"/>
-        <w:ind w:firstLine="420"/>
-      </w:pPr>
-      <w:r>
-        <w:rPr>
-          <w:rFonts w:ascii="宋体" w:hAnsi="宋体" w:eastAsia="宋体"/>
-          <w:b w:val="0"/>
-          <w:sz w:val="22"/>
-        </w:rPr>
-        <w:t>I'm happy when I read a good book. I can go to different worlds and meet interesting characters(角色). It's like having an adventure(冒险) in my mind.</w:t>
-      </w:r>
-    </w:p>
-    <w:p>
-      <w:pPr>
-        <w:spacing w:after="120" w:before="0" w:line="240" w:lineRule="auto"/>
-        <w:ind w:firstLine="420"/>
-      </w:pPr>
-      <w:r>
-        <w:rPr>
-          <w:rFonts w:ascii="宋体" w:hAnsi="宋体" w:eastAsia="宋体"/>
-          <w:b w:val="0"/>
-          <w:sz w:val="22"/>
-        </w:rPr>
-        <w:t>I'm happy when I help others. If I see a friend in trouble, I help him. When I give a hand, I see a smile on his face, and it makes me happy too.</w:t>
-      </w:r>
-    </w:p>
-    <w:p>
-      <w:pPr>
-        <w:spacing w:after="120" w:before="0" w:line="240" w:lineRule="auto"/>
-        <w:ind w:firstLine="420"/>
-      </w:pPr>
-      <w:r>
-        <w:rPr>
-          <w:rFonts w:ascii="宋体" w:hAnsi="宋体" w:eastAsia="宋体"/>
-          <w:b w:val="0"/>
-          <w:sz w:val="22"/>
-        </w:rPr>
-        <w:t>This is me. I'm happy in many ways. I know that happiness is all around me if I look for it.</w:t>
-      </w:r>
-    </w:p>
-    <w:p>
-      <w:pPr>
-        <w:spacing w:after="40" w:before="240" w:line="240" w:lineRule="auto"/>
+        <w:spacing w:before="200" w:after="40" w:line="240" w:lineRule="auto"/>
         <w:jc w:val="center"/>
       </w:pPr>
       <w:r>
@@ -1588,7 +2757,7 @@
           <w:b w:val="0"/>
           <w:sz w:val="18"/>
         </w:rPr>
-        <w:t>英语 · 四上 · 第一单元  第 3 页（共 4 页）</w:t>
+        <w:t>英语 · 四上 · 第一单元  第 3 页（共 4 页）· 高清图题版</w:t>
       </w:r>
     </w:p>
     <w:p>
@@ -1598,7 +2767,7 @@
     </w:p>
     <w:p>
       <w:pPr>
-        <w:spacing w:after="120" w:before="0" w:line="240" w:lineRule="auto"/>
+        <w:spacing w:before="0" w:after="80" w:line="240" w:lineRule="auto"/>
       </w:pPr>
       <w:r>
         <w:rPr>
@@ -1606,12 +2775,12 @@
           <w:b/>
           <w:sz w:val="22"/>
         </w:rPr>
-        <w:t>任务一：根据短文内容，选择正确答案，将序号写在题前括号内。</w:t>
+        <w:t>任务一：根据短文内容，选择正确答案。</w:t>
       </w:r>
     </w:p>
     <w:p>
       <w:pPr>
-        <w:spacing w:after="40" w:before="0" w:line="240" w:lineRule="auto"/>
+        <w:spacing w:before="0" w:after="20" w:line="240" w:lineRule="auto"/>
       </w:pPr>
       <w:r>
         <w:rPr>
@@ -1624,7 +2793,7 @@
     </w:p>
     <w:p>
       <w:pPr>
-        <w:spacing w:after="20" w:before="0" w:line="240" w:lineRule="auto"/>
+        <w:spacing w:before="0" w:after="20" w:line="240" w:lineRule="auto"/>
       </w:pPr>
       <w:r>
         <w:rPr>
@@ -1637,7 +2806,7 @@
     </w:p>
     <w:p>
       <w:pPr>
-        <w:spacing w:after="20" w:before="0" w:line="240" w:lineRule="auto"/>
+        <w:spacing w:before="0" w:after="20" w:line="240" w:lineRule="auto"/>
       </w:pPr>
       <w:r>
         <w:rPr>
@@ -1650,7 +2819,7 @@
     </w:p>
     <w:p>
       <w:pPr>
-        <w:spacing w:after="20" w:before="0" w:line="240" w:lineRule="auto"/>
+        <w:spacing w:before="0" w:after="20" w:line="240" w:lineRule="auto"/>
       </w:pPr>
       <w:r>
         <w:rPr>
@@ -1663,7 +2832,7 @@
     </w:p>
     <w:p>
       <w:pPr>
-        <w:spacing w:after="40" w:before="0" w:line="240" w:lineRule="auto"/>
+        <w:spacing w:before="0" w:after="20" w:line="240" w:lineRule="auto"/>
       </w:pPr>
       <w:r>
         <w:rPr>
@@ -1676,7 +2845,7 @@
     </w:p>
     <w:p>
       <w:pPr>
-        <w:spacing w:after="20" w:before="0" w:line="240" w:lineRule="auto"/>
+        <w:spacing w:before="0" w:after="20" w:line="240" w:lineRule="auto"/>
       </w:pPr>
       <w:r>
         <w:rPr>
@@ -1689,7 +2858,7 @@
     </w:p>
     <w:p>
       <w:pPr>
-        <w:spacing w:after="20" w:before="0" w:line="240" w:lineRule="auto"/>
+        <w:spacing w:before="0" w:after="20" w:line="240" w:lineRule="auto"/>
       </w:pPr>
       <w:r>
         <w:rPr>
@@ -1702,7 +2871,7 @@
     </w:p>
     <w:p>
       <w:pPr>
-        <w:spacing w:after="20" w:before="0" w:line="240" w:lineRule="auto"/>
+        <w:spacing w:before="0" w:after="20" w:line="240" w:lineRule="auto"/>
       </w:pPr>
       <w:r>
         <w:rPr>
@@ -1715,7 +2884,7 @@
     </w:p>
     <w:p>
       <w:pPr>
-        <w:spacing w:after="40" w:before="0" w:line="240" w:lineRule="auto"/>
+        <w:spacing w:before="0" w:after="20" w:line="240" w:lineRule="auto"/>
       </w:pPr>
       <w:r>
         <w:rPr>
@@ -1728,7 +2897,7 @@
     </w:p>
     <w:p>
       <w:pPr>
-        <w:spacing w:after="20" w:before="0" w:line="240" w:lineRule="auto"/>
+        <w:spacing w:before="0" w:after="20" w:line="240" w:lineRule="auto"/>
       </w:pPr>
       <w:r>
         <w:rPr>
@@ -1741,7 +2910,7 @@
     </w:p>
     <w:p>
       <w:pPr>
-        <w:spacing w:after="20" w:before="0" w:line="240" w:lineRule="auto"/>
+        <w:spacing w:before="0" w:after="20" w:line="240" w:lineRule="auto"/>
       </w:pPr>
       <w:r>
         <w:rPr>
@@ -1754,7 +2923,7 @@
     </w:p>
     <w:p>
       <w:pPr>
-        <w:spacing w:after="20" w:before="0" w:line="240" w:lineRule="auto"/>
+        <w:spacing w:before="0" w:after="20" w:line="240" w:lineRule="auto"/>
       </w:pPr>
       <w:r>
         <w:rPr>
@@ -1767,7 +2936,7 @@
     </w:p>
     <w:p>
       <w:pPr>
-        <w:spacing w:after="40" w:before="0" w:line="240" w:lineRule="auto"/>
+        <w:spacing w:before="0" w:after="20" w:line="240" w:lineRule="auto"/>
       </w:pPr>
       <w:r>
         <w:rPr>
@@ -1780,7 +2949,7 @@
     </w:p>
     <w:p>
       <w:pPr>
-        <w:spacing w:after="20" w:before="0" w:line="240" w:lineRule="auto"/>
+        <w:spacing w:before="0" w:after="20" w:line="240" w:lineRule="auto"/>
       </w:pPr>
       <w:r>
         <w:rPr>
@@ -1793,7 +2962,7 @@
     </w:p>
     <w:p>
       <w:pPr>
-        <w:spacing w:after="20" w:before="0" w:line="240" w:lineRule="auto"/>
+        <w:spacing w:before="0" w:after="20" w:line="240" w:lineRule="auto"/>
       </w:pPr>
       <w:r>
         <w:rPr>
@@ -1806,7 +2975,7 @@
     </w:p>
     <w:p>
       <w:pPr>
-        <w:spacing w:after="20" w:before="0" w:line="240" w:lineRule="auto"/>
+        <w:spacing w:before="0" w:after="20" w:line="240" w:lineRule="auto"/>
       </w:pPr>
       <w:r>
         <w:rPr>
@@ -1819,7 +2988,7 @@
     </w:p>
     <w:p>
       <w:pPr>
-        <w:spacing w:after="40" w:before="0" w:line="240" w:lineRule="auto"/>
+        <w:spacing w:before="0" w:after="20" w:line="240" w:lineRule="auto"/>
       </w:pPr>
       <w:r>
         <w:rPr>
@@ -1832,7 +3001,7 @@
     </w:p>
     <w:p>
       <w:pPr>
-        <w:spacing w:after="20" w:before="0" w:line="240" w:lineRule="auto"/>
+        <w:spacing w:before="0" w:after="20" w:line="240" w:lineRule="auto"/>
       </w:pPr>
       <w:r>
         <w:rPr>
@@ -1845,7 +3014,7 @@
     </w:p>
     <w:p>
       <w:pPr>
-        <w:spacing w:after="20" w:before="0" w:line="240" w:lineRule="auto"/>
+        <w:spacing w:before="0" w:after="20" w:line="240" w:lineRule="auto"/>
       </w:pPr>
       <w:r>
         <w:rPr>
@@ -1858,7 +3027,7 @@
     </w:p>
     <w:p>
       <w:pPr>
-        <w:spacing w:after="20" w:before="0" w:line="240" w:lineRule="auto"/>
+        <w:spacing w:before="0" w:after="20" w:line="240" w:lineRule="auto"/>
       </w:pPr>
       <w:r>
         <w:rPr>
@@ -1871,7 +3040,7 @@
     </w:p>
     <w:p>
       <w:pPr>
-        <w:spacing w:after="80" w:before="160" w:line="240" w:lineRule="auto"/>
+        <w:spacing w:before="160" w:after="80" w:line="240" w:lineRule="auto"/>
       </w:pPr>
       <w:r>
         <w:rPr>
@@ -1879,51 +3048,12 @@
           <w:b/>
           <w:sz w:val="22"/>
         </w:rPr>
-        <w:t>任务二：仿照范例，根据实际情况写一写。</w:t>
+        <w:t>任务二：仿写 I'm ________ when _________________________________</w:t>
       </w:r>
     </w:p>
     <w:p>
       <w:pPr>
-        <w:spacing w:after="120" w:before="0" w:line="240" w:lineRule="auto"/>
-      </w:pPr>
-      <w:r>
-        <w:rPr>
-          <w:rFonts w:ascii="宋体" w:hAnsi="宋体" w:eastAsia="宋体"/>
-          <w:b w:val="0"/>
-          <w:sz w:val="20"/>
-        </w:rPr>
-        <w:t>例：I'm happy when I read a good book.</w:t>
-      </w:r>
-    </w:p>
-    <w:p>
-      <w:pPr>
-        <w:spacing w:after="80" w:before="0" w:line="240" w:lineRule="auto"/>
-      </w:pPr>
-      <w:r>
-        <w:rPr>
-          <w:rFonts w:ascii="宋体" w:hAnsi="宋体" w:eastAsia="宋体"/>
-          <w:b w:val="0"/>
-          <w:sz w:val="22"/>
-        </w:rPr>
-        <w:t>I'm ________ when _______________________________________________</w:t>
-      </w:r>
-    </w:p>
-    <w:p>
-      <w:pPr>
-        <w:spacing w:after="160" w:before="0" w:line="240" w:lineRule="auto"/>
-      </w:pPr>
-      <w:r>
-        <w:rPr>
-          <w:rFonts w:ascii="宋体" w:hAnsi="宋体" w:eastAsia="宋体"/>
-          <w:b w:val="0"/>
-          <w:sz w:val="22"/>
-        </w:rPr>
-        <w:t>_________________________________________________________________</w:t>
-      </w:r>
-    </w:p>
-    <w:p>
-      <w:pPr>
-        <w:spacing w:after="160" w:before="320" w:line="240" w:lineRule="auto"/>
+        <w:spacing w:before="280" w:after="120" w:line="240" w:lineRule="auto"/>
         <w:jc w:val="center"/>
       </w:pPr>
       <w:r>
@@ -1937,23 +3067,33 @@
     </w:p>
     <w:p>
       <w:pPr>
-        <w:spacing w:after="60" w:before="0" w:line="240" w:lineRule="auto"/>
+        <w:spacing w:before="0" w:after="40" w:line="240" w:lineRule="auto"/>
       </w:pPr>
       <w:r>
-        <w:t>三：1A  2A  3B  4A  5B（据《听力材料》第一单元三）</w:t>
+        <w:rPr>
+          <w:rFonts w:ascii="宋体" w:hAnsi="宋体" w:eastAsia="宋体"/>
+          <w:b w:val="0"/>
+          <w:sz w:val="18"/>
+        </w:rPr>
+        <w:t>三：1A  2A  3B  4A  5B</w:t>
       </w:r>
     </w:p>
     <w:p>
       <w:pPr>
-        <w:spacing w:after="60" w:before="0" w:line="240" w:lineRule="auto"/>
+        <w:spacing w:before="0" w:after="40" w:line="240" w:lineRule="auto"/>
       </w:pPr>
       <w:r>
-        <w:t>四：1√  2√  3×  4×  5√（原文：房间乱；放学打扫房间）</w:t>
+        <w:rPr>
+          <w:rFonts w:ascii="宋体" w:hAnsi="宋体" w:eastAsia="宋体"/>
+          <w:b w:val="0"/>
+          <w:sz w:val="18"/>
+        </w:rPr>
+        <w:t>四：1√  2√  3×  4×  5√</w:t>
       </w:r>
     </w:p>
     <w:p>
       <w:pPr>
-        <w:spacing w:after="60" w:before="0" w:line="240" w:lineRule="auto"/>
+        <w:spacing w:before="0" w:after="40" w:line="240" w:lineRule="auto"/>
       </w:pPr>
       <w:r>
         <w:rPr>
@@ -1966,7 +3106,7 @@
     </w:p>
     <w:p>
       <w:pPr>
-        <w:spacing w:after="60" w:before="0" w:line="240" w:lineRule="auto"/>
+        <w:spacing w:before="0" w:after="40" w:line="240" w:lineRule="auto"/>
       </w:pPr>
       <w:r>
         <w:rPr>
@@ -1974,12 +3114,12 @@
           <w:b w:val="0"/>
           <w:sz w:val="18"/>
         </w:rPr>
-        <w:t>六：1 B/C/E（心情）  2 D/G/H（动作）  3 A/F/I（天气）</w:t>
+        <w:t>六：1 B/C/E  2 D/G/H  3 A/F/I</w:t>
       </w:r>
     </w:p>
     <w:p>
       <w:pPr>
-        <w:spacing w:after="60" w:before="0" w:line="240" w:lineRule="auto"/>
+        <w:spacing w:before="0" w:after="40" w:line="240" w:lineRule="auto"/>
       </w:pPr>
       <w:r>
         <w:rPr>
@@ -1992,7 +3132,7 @@
     </w:p>
     <w:p>
       <w:pPr>
-        <w:spacing w:after="60" w:before="0" w:line="240" w:lineRule="auto"/>
+        <w:spacing w:before="0" w:after="40" w:line="240" w:lineRule="auto"/>
       </w:pPr>
       <w:r>
         <w:rPr>
@@ -2005,7 +3145,7 @@
     </w:p>
     <w:p>
       <w:pPr>
-        <w:spacing w:after="60" w:before="0" w:line="240" w:lineRule="auto"/>
+        <w:spacing w:before="0" w:after="40" w:line="240" w:lineRule="auto"/>
       </w:pPr>
       <w:r>
         <w:rPr>
@@ -2018,7 +3158,7 @@
     </w:p>
     <w:p>
       <w:pPr>
-        <w:spacing w:after="60" w:before="0" w:line="240" w:lineRule="auto"/>
+        <w:spacing w:before="0" w:after="40" w:line="240" w:lineRule="auto"/>
       </w:pPr>
       <w:r>
         <w:rPr>
@@ -2031,7 +3171,7 @@
     </w:p>
     <w:p>
       <w:pPr>
-        <w:spacing w:after="40" w:before="240" w:line="240" w:lineRule="auto"/>
+        <w:spacing w:before="200" w:after="40" w:line="240" w:lineRule="auto"/>
         <w:jc w:val="center"/>
       </w:pPr>
       <w:r>
@@ -2040,12 +3180,12 @@
           <w:b w:val="0"/>
           <w:sz w:val="18"/>
         </w:rPr>
-        <w:t>英语 · 四上 · 第一单元  第 4 页（共 4 页）</w:t>
+        <w:t>英语 · 四上 · 第一单元  第 4 页（共 4 页）· 高清图题版</w:t>
       </w:r>
     </w:p>
     <w:sectPr>
       <w:pgSz w:w="12240" w:h="15840"/>
-      <w:pgMar w:top="1020" w:right="1134" w:bottom="850" w:left="1134" w:header="720" w:footer="720" w:gutter="0"/>
+      <w:pgMar w:top="907" w:right="1020" w:bottom="794" w:left="1020" w:header="720" w:footer="720" w:gutter="0"/>
       <w:cols w:space="720"/>
       <w:docGrid w:linePitch="360"/>
     </w:sectPr>

</xml_diff>